<commit_message>
lab-04: completed p2 b5
</commit_message>
<xml_diff>
--- a/lab-04/Cac-lenh-co-ban-voi-Docker.docx
+++ b/lab-04/Cac-lenh-co-ban-voi-Docker.docx
@@ -4,6 +4,17 @@
   <w:body>
     <w:p>
       <w:r>
+        <w:t>L</w:t>
+      </w:r>
+      <w:r>
+        <w:t>ab</w:t>
+      </w:r>
+      <w:r>
+        <w:t>: 04</w:t>
+      </w:r>
+    </w:p>
+    <w:p>
+      <w:r>
         <w:t>Họ tên: Ngô Nhựt Huy</w:t>
       </w:r>
     </w:p>
@@ -12,19 +23,2957 @@
         <w:t>MSSV: 22636591</w:t>
       </w:r>
     </w:p>
+    <w:p/>
+    <w:sdt>
+      <w:sdtPr>
+        <w:id w:val="-1428723434"/>
+        <w:docPartObj>
+          <w:docPartGallery w:val="Table of Contents"/>
+          <w:docPartUnique/>
+        </w:docPartObj>
+      </w:sdtPr>
+      <w:sdtEndPr>
+        <w:rPr>
+          <w:rFonts w:ascii="Times New Roman" w:eastAsiaTheme="minorHAnsi" w:hAnsi="Times New Roman" w:cstheme="minorBidi"/>
+          <w:b/>
+          <w:bCs/>
+          <w:noProof/>
+          <w:color w:val="auto"/>
+          <w:kern w:val="2"/>
+          <w:sz w:val="28"/>
+          <w:szCs w:val="24"/>
+          <w14:ligatures w14:val="standardContextual"/>
+        </w:rPr>
+      </w:sdtEndPr>
+      <w:sdtContent>
+        <w:p>
+          <w:pPr>
+            <w:pStyle w:val="TOCHeading"/>
+            <w:rPr>
+              <w:rFonts w:ascii="Times New Roman" w:hAnsi="Times New Roman" w:cs="Times New Roman"/>
+              <w:b/>
+              <w:bCs/>
+              <w:color w:val="auto"/>
+            </w:rPr>
+          </w:pPr>
+          <w:r>
+            <w:rPr>
+              <w:rFonts w:ascii="Times New Roman" w:hAnsi="Times New Roman" w:cs="Times New Roman"/>
+              <w:b/>
+              <w:bCs/>
+              <w:color w:val="auto"/>
+            </w:rPr>
+            <w:t>Mục lục</w:t>
+          </w:r>
+        </w:p>
+        <w:p>
+          <w:pPr>
+            <w:pStyle w:val="TOC1"/>
+            <w:tabs>
+              <w:tab w:val="left" w:pos="480"/>
+              <w:tab w:val="right" w:leader="dot" w:pos="9350"/>
+            </w:tabs>
+            <w:rPr>
+              <w:noProof/>
+            </w:rPr>
+          </w:pPr>
+          <w:r>
+            <w:fldChar w:fldCharType="begin"/>
+          </w:r>
+          <w:r>
+            <w:instrText xml:space="preserve"> TOC \o "1-3" \h \z \u </w:instrText>
+          </w:r>
+          <w:r>
+            <w:fldChar w:fldCharType="separate"/>
+          </w:r>
+          <w:hyperlink w:anchor="_Toc225619413" w:history="1">
+            <w:r>
+              <w:rPr>
+                <w:rStyle w:val="Hyperlink"/>
+                <w:noProof/>
+              </w:rPr>
+              <w:t>I.</w:t>
+            </w:r>
+            <w:r>
+              <w:rPr>
+                <w:noProof/>
+              </w:rPr>
+              <w:tab/>
+            </w:r>
+            <w:r>
+              <w:rPr>
+                <w:rStyle w:val="Hyperlink"/>
+                <w:noProof/>
+              </w:rPr>
+              <w:t>Các lệnh cơ bản thao tác với Docker</w:t>
+            </w:r>
+            <w:r>
+              <w:rPr>
+                <w:noProof/>
+                <w:webHidden/>
+              </w:rPr>
+              <w:tab/>
+            </w:r>
+            <w:r>
+              <w:rPr>
+                <w:noProof/>
+                <w:webHidden/>
+              </w:rPr>
+              <w:fldChar w:fldCharType="begin"/>
+            </w:r>
+            <w:r>
+              <w:rPr>
+                <w:noProof/>
+                <w:webHidden/>
+              </w:rPr>
+              <w:instrText xml:space="preserve"> PAGEREF _Toc225619413 \h </w:instrText>
+            </w:r>
+            <w:r>
+              <w:rPr>
+                <w:noProof/>
+                <w:webHidden/>
+              </w:rPr>
+            </w:r>
+            <w:r>
+              <w:rPr>
+                <w:noProof/>
+                <w:webHidden/>
+              </w:rPr>
+              <w:fldChar w:fldCharType="separate"/>
+            </w:r>
+            <w:r>
+              <w:rPr>
+                <w:noProof/>
+                <w:webHidden/>
+              </w:rPr>
+              <w:t>1</w:t>
+            </w:r>
+            <w:r>
+              <w:rPr>
+                <w:noProof/>
+                <w:webHidden/>
+              </w:rPr>
+              <w:fldChar w:fldCharType="end"/>
+            </w:r>
+          </w:hyperlink>
+        </w:p>
+        <w:p>
+          <w:pPr>
+            <w:pStyle w:val="TOC2"/>
+            <w:tabs>
+              <w:tab w:val="left" w:pos="720"/>
+              <w:tab w:val="right" w:leader="dot" w:pos="9350"/>
+            </w:tabs>
+            <w:rPr>
+              <w:noProof/>
+            </w:rPr>
+          </w:pPr>
+          <w:hyperlink w:anchor="_Toc225619414" w:history="1">
+            <w:r>
+              <w:rPr>
+                <w:rStyle w:val="Hyperlink"/>
+                <w:noProof/>
+              </w:rPr>
+              <w:t>1.</w:t>
+            </w:r>
+            <w:r>
+              <w:rPr>
+                <w:noProof/>
+              </w:rPr>
+              <w:tab/>
+            </w:r>
+            <w:r>
+              <w:rPr>
+                <w:rStyle w:val="Hyperlink"/>
+                <w:noProof/>
+              </w:rPr>
+              <w:t>docker –version</w:t>
+            </w:r>
+            <w:r>
+              <w:rPr>
+                <w:noProof/>
+                <w:webHidden/>
+              </w:rPr>
+              <w:tab/>
+            </w:r>
+            <w:r>
+              <w:rPr>
+                <w:noProof/>
+                <w:webHidden/>
+              </w:rPr>
+              <w:fldChar w:fldCharType="begin"/>
+            </w:r>
+            <w:r>
+              <w:rPr>
+                <w:noProof/>
+                <w:webHidden/>
+              </w:rPr>
+              <w:instrText xml:space="preserve"> PAGEREF _Toc225619414 \h </w:instrText>
+            </w:r>
+            <w:r>
+              <w:rPr>
+                <w:noProof/>
+                <w:webHidden/>
+              </w:rPr>
+            </w:r>
+            <w:r>
+              <w:rPr>
+                <w:noProof/>
+                <w:webHidden/>
+              </w:rPr>
+              <w:fldChar w:fldCharType="separate"/>
+            </w:r>
+            <w:r>
+              <w:rPr>
+                <w:noProof/>
+                <w:webHidden/>
+              </w:rPr>
+              <w:t>1</w:t>
+            </w:r>
+            <w:r>
+              <w:rPr>
+                <w:noProof/>
+                <w:webHidden/>
+              </w:rPr>
+              <w:fldChar w:fldCharType="end"/>
+            </w:r>
+          </w:hyperlink>
+        </w:p>
+        <w:p>
+          <w:pPr>
+            <w:pStyle w:val="TOC2"/>
+            <w:tabs>
+              <w:tab w:val="left" w:pos="720"/>
+              <w:tab w:val="right" w:leader="dot" w:pos="9350"/>
+            </w:tabs>
+            <w:rPr>
+              <w:noProof/>
+            </w:rPr>
+          </w:pPr>
+          <w:hyperlink w:anchor="_Toc225619415" w:history="1">
+            <w:r>
+              <w:rPr>
+                <w:rStyle w:val="Hyperlink"/>
+                <w:noProof/>
+              </w:rPr>
+              <w:t>2.</w:t>
+            </w:r>
+            <w:r>
+              <w:rPr>
+                <w:noProof/>
+              </w:rPr>
+              <w:tab/>
+            </w:r>
+            <w:r>
+              <w:rPr>
+                <w:rStyle w:val="Hyperlink"/>
+                <w:noProof/>
+              </w:rPr>
+              <w:t>docker run hello-world</w:t>
+            </w:r>
+            <w:r>
+              <w:rPr>
+                <w:noProof/>
+                <w:webHidden/>
+              </w:rPr>
+              <w:tab/>
+            </w:r>
+            <w:r>
+              <w:rPr>
+                <w:noProof/>
+                <w:webHidden/>
+              </w:rPr>
+              <w:fldChar w:fldCharType="begin"/>
+            </w:r>
+            <w:r>
+              <w:rPr>
+                <w:noProof/>
+                <w:webHidden/>
+              </w:rPr>
+              <w:instrText xml:space="preserve"> PAGEREF _Toc225619415 \h </w:instrText>
+            </w:r>
+            <w:r>
+              <w:rPr>
+                <w:noProof/>
+                <w:webHidden/>
+              </w:rPr>
+            </w:r>
+            <w:r>
+              <w:rPr>
+                <w:noProof/>
+                <w:webHidden/>
+              </w:rPr>
+              <w:fldChar w:fldCharType="separate"/>
+            </w:r>
+            <w:r>
+              <w:rPr>
+                <w:noProof/>
+                <w:webHidden/>
+              </w:rPr>
+              <w:t>2</w:t>
+            </w:r>
+            <w:r>
+              <w:rPr>
+                <w:noProof/>
+                <w:webHidden/>
+              </w:rPr>
+              <w:fldChar w:fldCharType="end"/>
+            </w:r>
+          </w:hyperlink>
+        </w:p>
+        <w:p>
+          <w:pPr>
+            <w:pStyle w:val="TOC2"/>
+            <w:tabs>
+              <w:tab w:val="left" w:pos="720"/>
+              <w:tab w:val="right" w:leader="dot" w:pos="9350"/>
+            </w:tabs>
+            <w:rPr>
+              <w:noProof/>
+            </w:rPr>
+          </w:pPr>
+          <w:hyperlink w:anchor="_Toc225619416" w:history="1">
+            <w:r>
+              <w:rPr>
+                <w:rStyle w:val="Hyperlink"/>
+                <w:noProof/>
+              </w:rPr>
+              <w:t>3.</w:t>
+            </w:r>
+            <w:r>
+              <w:rPr>
+                <w:noProof/>
+              </w:rPr>
+              <w:tab/>
+            </w:r>
+            <w:r>
+              <w:rPr>
+                <w:rStyle w:val="Hyperlink"/>
+                <w:noProof/>
+              </w:rPr>
+              <w:t>docker pull nginx</w:t>
+            </w:r>
+            <w:r>
+              <w:rPr>
+                <w:noProof/>
+                <w:webHidden/>
+              </w:rPr>
+              <w:tab/>
+            </w:r>
+            <w:r>
+              <w:rPr>
+                <w:noProof/>
+                <w:webHidden/>
+              </w:rPr>
+              <w:fldChar w:fldCharType="begin"/>
+            </w:r>
+            <w:r>
+              <w:rPr>
+                <w:noProof/>
+                <w:webHidden/>
+              </w:rPr>
+              <w:instrText xml:space="preserve"> PAGEREF _Toc225619416 \h </w:instrText>
+            </w:r>
+            <w:r>
+              <w:rPr>
+                <w:noProof/>
+                <w:webHidden/>
+              </w:rPr>
+            </w:r>
+            <w:r>
+              <w:rPr>
+                <w:noProof/>
+                <w:webHidden/>
+              </w:rPr>
+              <w:fldChar w:fldCharType="separate"/>
+            </w:r>
+            <w:r>
+              <w:rPr>
+                <w:noProof/>
+                <w:webHidden/>
+              </w:rPr>
+              <w:t>2</w:t>
+            </w:r>
+            <w:r>
+              <w:rPr>
+                <w:noProof/>
+                <w:webHidden/>
+              </w:rPr>
+              <w:fldChar w:fldCharType="end"/>
+            </w:r>
+          </w:hyperlink>
+        </w:p>
+        <w:p>
+          <w:pPr>
+            <w:pStyle w:val="TOC2"/>
+            <w:tabs>
+              <w:tab w:val="left" w:pos="720"/>
+              <w:tab w:val="right" w:leader="dot" w:pos="9350"/>
+            </w:tabs>
+            <w:rPr>
+              <w:noProof/>
+            </w:rPr>
+          </w:pPr>
+          <w:hyperlink w:anchor="_Toc225619417" w:history="1">
+            <w:r>
+              <w:rPr>
+                <w:rStyle w:val="Hyperlink"/>
+                <w:noProof/>
+              </w:rPr>
+              <w:t>4.</w:t>
+            </w:r>
+            <w:r>
+              <w:rPr>
+                <w:noProof/>
+              </w:rPr>
+              <w:tab/>
+            </w:r>
+            <w:r>
+              <w:rPr>
+                <w:rStyle w:val="Hyperlink"/>
+                <w:noProof/>
+              </w:rPr>
+              <w:t>docker images</w:t>
+            </w:r>
+            <w:r>
+              <w:rPr>
+                <w:noProof/>
+                <w:webHidden/>
+              </w:rPr>
+              <w:tab/>
+            </w:r>
+            <w:r>
+              <w:rPr>
+                <w:noProof/>
+                <w:webHidden/>
+              </w:rPr>
+              <w:fldChar w:fldCharType="begin"/>
+            </w:r>
+            <w:r>
+              <w:rPr>
+                <w:noProof/>
+                <w:webHidden/>
+              </w:rPr>
+              <w:instrText xml:space="preserve"> PAGEREF _Toc225619417 \h </w:instrText>
+            </w:r>
+            <w:r>
+              <w:rPr>
+                <w:noProof/>
+                <w:webHidden/>
+              </w:rPr>
+            </w:r>
+            <w:r>
+              <w:rPr>
+                <w:noProof/>
+                <w:webHidden/>
+              </w:rPr>
+              <w:fldChar w:fldCharType="separate"/>
+            </w:r>
+            <w:r>
+              <w:rPr>
+                <w:noProof/>
+                <w:webHidden/>
+              </w:rPr>
+              <w:t>3</w:t>
+            </w:r>
+            <w:r>
+              <w:rPr>
+                <w:noProof/>
+                <w:webHidden/>
+              </w:rPr>
+              <w:fldChar w:fldCharType="end"/>
+            </w:r>
+          </w:hyperlink>
+        </w:p>
+        <w:p>
+          <w:pPr>
+            <w:pStyle w:val="TOC2"/>
+            <w:tabs>
+              <w:tab w:val="left" w:pos="720"/>
+              <w:tab w:val="right" w:leader="dot" w:pos="9350"/>
+            </w:tabs>
+            <w:rPr>
+              <w:noProof/>
+            </w:rPr>
+          </w:pPr>
+          <w:hyperlink w:anchor="_Toc225619418" w:history="1">
+            <w:r>
+              <w:rPr>
+                <w:rStyle w:val="Hyperlink"/>
+                <w:noProof/>
+              </w:rPr>
+              <w:t>5.</w:t>
+            </w:r>
+            <w:r>
+              <w:rPr>
+                <w:noProof/>
+              </w:rPr>
+              <w:tab/>
+            </w:r>
+            <w:r>
+              <w:rPr>
+                <w:rStyle w:val="Hyperlink"/>
+                <w:noProof/>
+              </w:rPr>
+              <w:t>docker run -d nginx</w:t>
+            </w:r>
+            <w:r>
+              <w:rPr>
+                <w:noProof/>
+                <w:webHidden/>
+              </w:rPr>
+              <w:tab/>
+            </w:r>
+            <w:r>
+              <w:rPr>
+                <w:noProof/>
+                <w:webHidden/>
+              </w:rPr>
+              <w:fldChar w:fldCharType="begin"/>
+            </w:r>
+            <w:r>
+              <w:rPr>
+                <w:noProof/>
+                <w:webHidden/>
+              </w:rPr>
+              <w:instrText xml:space="preserve"> PAGEREF _Toc225619418 \h </w:instrText>
+            </w:r>
+            <w:r>
+              <w:rPr>
+                <w:noProof/>
+                <w:webHidden/>
+              </w:rPr>
+            </w:r>
+            <w:r>
+              <w:rPr>
+                <w:noProof/>
+                <w:webHidden/>
+              </w:rPr>
+              <w:fldChar w:fldCharType="separate"/>
+            </w:r>
+            <w:r>
+              <w:rPr>
+                <w:noProof/>
+                <w:webHidden/>
+              </w:rPr>
+              <w:t>3</w:t>
+            </w:r>
+            <w:r>
+              <w:rPr>
+                <w:noProof/>
+                <w:webHidden/>
+              </w:rPr>
+              <w:fldChar w:fldCharType="end"/>
+            </w:r>
+          </w:hyperlink>
+        </w:p>
+        <w:p>
+          <w:pPr>
+            <w:pStyle w:val="TOC2"/>
+            <w:tabs>
+              <w:tab w:val="left" w:pos="720"/>
+              <w:tab w:val="right" w:leader="dot" w:pos="9350"/>
+            </w:tabs>
+            <w:rPr>
+              <w:noProof/>
+            </w:rPr>
+          </w:pPr>
+          <w:hyperlink w:anchor="_Toc225619419" w:history="1">
+            <w:r>
+              <w:rPr>
+                <w:rStyle w:val="Hyperlink"/>
+                <w:noProof/>
+              </w:rPr>
+              <w:t>6.</w:t>
+            </w:r>
+            <w:r>
+              <w:rPr>
+                <w:noProof/>
+              </w:rPr>
+              <w:tab/>
+            </w:r>
+            <w:r>
+              <w:rPr>
+                <w:rStyle w:val="Hyperlink"/>
+                <w:noProof/>
+              </w:rPr>
+              <w:t>docker ps</w:t>
+            </w:r>
+            <w:r>
+              <w:rPr>
+                <w:noProof/>
+                <w:webHidden/>
+              </w:rPr>
+              <w:tab/>
+            </w:r>
+            <w:r>
+              <w:rPr>
+                <w:noProof/>
+                <w:webHidden/>
+              </w:rPr>
+              <w:fldChar w:fldCharType="begin"/>
+            </w:r>
+            <w:r>
+              <w:rPr>
+                <w:noProof/>
+                <w:webHidden/>
+              </w:rPr>
+              <w:instrText xml:space="preserve"> PAGEREF _Toc225619419 \h </w:instrText>
+            </w:r>
+            <w:r>
+              <w:rPr>
+                <w:noProof/>
+                <w:webHidden/>
+              </w:rPr>
+            </w:r>
+            <w:r>
+              <w:rPr>
+                <w:noProof/>
+                <w:webHidden/>
+              </w:rPr>
+              <w:fldChar w:fldCharType="separate"/>
+            </w:r>
+            <w:r>
+              <w:rPr>
+                <w:noProof/>
+                <w:webHidden/>
+              </w:rPr>
+              <w:t>3</w:t>
+            </w:r>
+            <w:r>
+              <w:rPr>
+                <w:noProof/>
+                <w:webHidden/>
+              </w:rPr>
+              <w:fldChar w:fldCharType="end"/>
+            </w:r>
+          </w:hyperlink>
+        </w:p>
+        <w:p>
+          <w:pPr>
+            <w:pStyle w:val="TOC2"/>
+            <w:tabs>
+              <w:tab w:val="left" w:pos="720"/>
+              <w:tab w:val="right" w:leader="dot" w:pos="9350"/>
+            </w:tabs>
+            <w:rPr>
+              <w:noProof/>
+            </w:rPr>
+          </w:pPr>
+          <w:hyperlink w:anchor="_Toc225619420" w:history="1">
+            <w:r>
+              <w:rPr>
+                <w:rStyle w:val="Hyperlink"/>
+                <w:noProof/>
+              </w:rPr>
+              <w:t>7.</w:t>
+            </w:r>
+            <w:r>
+              <w:rPr>
+                <w:noProof/>
+              </w:rPr>
+              <w:tab/>
+            </w:r>
+            <w:r>
+              <w:rPr>
+                <w:rStyle w:val="Hyperlink"/>
+                <w:noProof/>
+              </w:rPr>
+              <w:t>docker ps -a</w:t>
+            </w:r>
+            <w:r>
+              <w:rPr>
+                <w:noProof/>
+                <w:webHidden/>
+              </w:rPr>
+              <w:tab/>
+            </w:r>
+            <w:r>
+              <w:rPr>
+                <w:noProof/>
+                <w:webHidden/>
+              </w:rPr>
+              <w:fldChar w:fldCharType="begin"/>
+            </w:r>
+            <w:r>
+              <w:rPr>
+                <w:noProof/>
+                <w:webHidden/>
+              </w:rPr>
+              <w:instrText xml:space="preserve"> PAGEREF _Toc225619420 \h </w:instrText>
+            </w:r>
+            <w:r>
+              <w:rPr>
+                <w:noProof/>
+                <w:webHidden/>
+              </w:rPr>
+            </w:r>
+            <w:r>
+              <w:rPr>
+                <w:noProof/>
+                <w:webHidden/>
+              </w:rPr>
+              <w:fldChar w:fldCharType="separate"/>
+            </w:r>
+            <w:r>
+              <w:rPr>
+                <w:noProof/>
+                <w:webHidden/>
+              </w:rPr>
+              <w:t>4</w:t>
+            </w:r>
+            <w:r>
+              <w:rPr>
+                <w:noProof/>
+                <w:webHidden/>
+              </w:rPr>
+              <w:fldChar w:fldCharType="end"/>
+            </w:r>
+          </w:hyperlink>
+        </w:p>
+        <w:p>
+          <w:pPr>
+            <w:pStyle w:val="TOC2"/>
+            <w:tabs>
+              <w:tab w:val="left" w:pos="720"/>
+              <w:tab w:val="right" w:leader="dot" w:pos="9350"/>
+            </w:tabs>
+            <w:rPr>
+              <w:noProof/>
+            </w:rPr>
+          </w:pPr>
+          <w:hyperlink w:anchor="_Toc225619421" w:history="1">
+            <w:r>
+              <w:rPr>
+                <w:rStyle w:val="Hyperlink"/>
+                <w:noProof/>
+              </w:rPr>
+              <w:t>8.</w:t>
+            </w:r>
+            <w:r>
+              <w:rPr>
+                <w:noProof/>
+              </w:rPr>
+              <w:tab/>
+            </w:r>
+            <w:r>
+              <w:rPr>
+                <w:rStyle w:val="Hyperlink"/>
+                <w:noProof/>
+              </w:rPr>
+              <w:t>docker logs &lt;container_id&gt;</w:t>
+            </w:r>
+            <w:r>
+              <w:rPr>
+                <w:noProof/>
+                <w:webHidden/>
+              </w:rPr>
+              <w:tab/>
+            </w:r>
+            <w:r>
+              <w:rPr>
+                <w:noProof/>
+                <w:webHidden/>
+              </w:rPr>
+              <w:fldChar w:fldCharType="begin"/>
+            </w:r>
+            <w:r>
+              <w:rPr>
+                <w:noProof/>
+                <w:webHidden/>
+              </w:rPr>
+              <w:instrText xml:space="preserve"> PAGEREF _Toc225619421 \h </w:instrText>
+            </w:r>
+            <w:r>
+              <w:rPr>
+                <w:noProof/>
+                <w:webHidden/>
+              </w:rPr>
+            </w:r>
+            <w:r>
+              <w:rPr>
+                <w:noProof/>
+                <w:webHidden/>
+              </w:rPr>
+              <w:fldChar w:fldCharType="separate"/>
+            </w:r>
+            <w:r>
+              <w:rPr>
+                <w:noProof/>
+                <w:webHidden/>
+              </w:rPr>
+              <w:t>4</w:t>
+            </w:r>
+            <w:r>
+              <w:rPr>
+                <w:noProof/>
+                <w:webHidden/>
+              </w:rPr>
+              <w:fldChar w:fldCharType="end"/>
+            </w:r>
+          </w:hyperlink>
+        </w:p>
+        <w:p>
+          <w:pPr>
+            <w:pStyle w:val="TOC2"/>
+            <w:tabs>
+              <w:tab w:val="left" w:pos="720"/>
+              <w:tab w:val="right" w:leader="dot" w:pos="9350"/>
+            </w:tabs>
+            <w:rPr>
+              <w:noProof/>
+            </w:rPr>
+          </w:pPr>
+          <w:hyperlink w:anchor="_Toc225619422" w:history="1">
+            <w:r>
+              <w:rPr>
+                <w:rStyle w:val="Hyperlink"/>
+                <w:noProof/>
+              </w:rPr>
+              <w:t>9.</w:t>
+            </w:r>
+            <w:r>
+              <w:rPr>
+                <w:noProof/>
+              </w:rPr>
+              <w:tab/>
+            </w:r>
+            <w:r>
+              <w:rPr>
+                <w:rStyle w:val="Hyperlink"/>
+                <w:noProof/>
+              </w:rPr>
+              <w:t>docker exec -it &lt;container_id&gt; /bin/sh</w:t>
+            </w:r>
+            <w:r>
+              <w:rPr>
+                <w:noProof/>
+                <w:webHidden/>
+              </w:rPr>
+              <w:tab/>
+            </w:r>
+            <w:r>
+              <w:rPr>
+                <w:noProof/>
+                <w:webHidden/>
+              </w:rPr>
+              <w:fldChar w:fldCharType="begin"/>
+            </w:r>
+            <w:r>
+              <w:rPr>
+                <w:noProof/>
+                <w:webHidden/>
+              </w:rPr>
+              <w:instrText xml:space="preserve"> PAGEREF _Toc225619422 \h </w:instrText>
+            </w:r>
+            <w:r>
+              <w:rPr>
+                <w:noProof/>
+                <w:webHidden/>
+              </w:rPr>
+            </w:r>
+            <w:r>
+              <w:rPr>
+                <w:noProof/>
+                <w:webHidden/>
+              </w:rPr>
+              <w:fldChar w:fldCharType="separate"/>
+            </w:r>
+            <w:r>
+              <w:rPr>
+                <w:noProof/>
+                <w:webHidden/>
+              </w:rPr>
+              <w:t>5</w:t>
+            </w:r>
+            <w:r>
+              <w:rPr>
+                <w:noProof/>
+                <w:webHidden/>
+              </w:rPr>
+              <w:fldChar w:fldCharType="end"/>
+            </w:r>
+          </w:hyperlink>
+        </w:p>
+        <w:p>
+          <w:pPr>
+            <w:pStyle w:val="TOC2"/>
+            <w:tabs>
+              <w:tab w:val="left" w:pos="960"/>
+              <w:tab w:val="right" w:leader="dot" w:pos="9350"/>
+            </w:tabs>
+            <w:rPr>
+              <w:noProof/>
+            </w:rPr>
+          </w:pPr>
+          <w:hyperlink w:anchor="_Toc225619423" w:history="1">
+            <w:r>
+              <w:rPr>
+                <w:rStyle w:val="Hyperlink"/>
+                <w:noProof/>
+              </w:rPr>
+              <w:t>10.</w:t>
+            </w:r>
+            <w:r>
+              <w:rPr>
+                <w:noProof/>
+              </w:rPr>
+              <w:tab/>
+            </w:r>
+            <w:r>
+              <w:rPr>
+                <w:rStyle w:val="Hyperlink"/>
+                <w:noProof/>
+              </w:rPr>
+              <w:t>docker stop &lt;container_id&gt;</w:t>
+            </w:r>
+            <w:r>
+              <w:rPr>
+                <w:noProof/>
+                <w:webHidden/>
+              </w:rPr>
+              <w:tab/>
+            </w:r>
+            <w:r>
+              <w:rPr>
+                <w:noProof/>
+                <w:webHidden/>
+              </w:rPr>
+              <w:fldChar w:fldCharType="begin"/>
+            </w:r>
+            <w:r>
+              <w:rPr>
+                <w:noProof/>
+                <w:webHidden/>
+              </w:rPr>
+              <w:instrText xml:space="preserve"> PAGEREF _Toc225619423 \h </w:instrText>
+            </w:r>
+            <w:r>
+              <w:rPr>
+                <w:noProof/>
+                <w:webHidden/>
+              </w:rPr>
+            </w:r>
+            <w:r>
+              <w:rPr>
+                <w:noProof/>
+                <w:webHidden/>
+              </w:rPr>
+              <w:fldChar w:fldCharType="separate"/>
+            </w:r>
+            <w:r>
+              <w:rPr>
+                <w:noProof/>
+                <w:webHidden/>
+              </w:rPr>
+              <w:t>5</w:t>
+            </w:r>
+            <w:r>
+              <w:rPr>
+                <w:noProof/>
+                <w:webHidden/>
+              </w:rPr>
+              <w:fldChar w:fldCharType="end"/>
+            </w:r>
+          </w:hyperlink>
+        </w:p>
+        <w:p>
+          <w:pPr>
+            <w:pStyle w:val="TOC2"/>
+            <w:tabs>
+              <w:tab w:val="left" w:pos="960"/>
+              <w:tab w:val="right" w:leader="dot" w:pos="9350"/>
+            </w:tabs>
+            <w:rPr>
+              <w:noProof/>
+            </w:rPr>
+          </w:pPr>
+          <w:hyperlink w:anchor="_Toc225619424" w:history="1">
+            <w:r>
+              <w:rPr>
+                <w:rStyle w:val="Hyperlink"/>
+                <w:noProof/>
+              </w:rPr>
+              <w:t>11.</w:t>
+            </w:r>
+            <w:r>
+              <w:rPr>
+                <w:noProof/>
+              </w:rPr>
+              <w:tab/>
+            </w:r>
+            <w:r>
+              <w:rPr>
+                <w:rStyle w:val="Hyperlink"/>
+                <w:noProof/>
+              </w:rPr>
+              <w:t>docker restart &lt;container_id&gt;</w:t>
+            </w:r>
+            <w:r>
+              <w:rPr>
+                <w:noProof/>
+                <w:webHidden/>
+              </w:rPr>
+              <w:tab/>
+            </w:r>
+            <w:r>
+              <w:rPr>
+                <w:noProof/>
+                <w:webHidden/>
+              </w:rPr>
+              <w:fldChar w:fldCharType="begin"/>
+            </w:r>
+            <w:r>
+              <w:rPr>
+                <w:noProof/>
+                <w:webHidden/>
+              </w:rPr>
+              <w:instrText xml:space="preserve"> PAGEREF _Toc225619424 \h </w:instrText>
+            </w:r>
+            <w:r>
+              <w:rPr>
+                <w:noProof/>
+                <w:webHidden/>
+              </w:rPr>
+            </w:r>
+            <w:r>
+              <w:rPr>
+                <w:noProof/>
+                <w:webHidden/>
+              </w:rPr>
+              <w:fldChar w:fldCharType="separate"/>
+            </w:r>
+            <w:r>
+              <w:rPr>
+                <w:noProof/>
+                <w:webHidden/>
+              </w:rPr>
+              <w:t>6</w:t>
+            </w:r>
+            <w:r>
+              <w:rPr>
+                <w:noProof/>
+                <w:webHidden/>
+              </w:rPr>
+              <w:fldChar w:fldCharType="end"/>
+            </w:r>
+          </w:hyperlink>
+        </w:p>
+        <w:p>
+          <w:pPr>
+            <w:pStyle w:val="TOC2"/>
+            <w:tabs>
+              <w:tab w:val="left" w:pos="960"/>
+              <w:tab w:val="right" w:leader="dot" w:pos="9350"/>
+            </w:tabs>
+            <w:rPr>
+              <w:noProof/>
+            </w:rPr>
+          </w:pPr>
+          <w:hyperlink w:anchor="_Toc225619425" w:history="1">
+            <w:r>
+              <w:rPr>
+                <w:rStyle w:val="Hyperlink"/>
+                <w:noProof/>
+              </w:rPr>
+              <w:t>12.</w:t>
+            </w:r>
+            <w:r>
+              <w:rPr>
+                <w:noProof/>
+              </w:rPr>
+              <w:tab/>
+            </w:r>
+            <w:r>
+              <w:rPr>
+                <w:rStyle w:val="Hyperlink"/>
+                <w:noProof/>
+              </w:rPr>
+              <w:t>docker rm &lt;container_id&gt;</w:t>
+            </w:r>
+            <w:r>
+              <w:rPr>
+                <w:noProof/>
+                <w:webHidden/>
+              </w:rPr>
+              <w:tab/>
+            </w:r>
+            <w:r>
+              <w:rPr>
+                <w:noProof/>
+                <w:webHidden/>
+              </w:rPr>
+              <w:fldChar w:fldCharType="begin"/>
+            </w:r>
+            <w:r>
+              <w:rPr>
+                <w:noProof/>
+                <w:webHidden/>
+              </w:rPr>
+              <w:instrText xml:space="preserve"> PAGEREF _Toc225619425 \h </w:instrText>
+            </w:r>
+            <w:r>
+              <w:rPr>
+                <w:noProof/>
+                <w:webHidden/>
+              </w:rPr>
+            </w:r>
+            <w:r>
+              <w:rPr>
+                <w:noProof/>
+                <w:webHidden/>
+              </w:rPr>
+              <w:fldChar w:fldCharType="separate"/>
+            </w:r>
+            <w:r>
+              <w:rPr>
+                <w:noProof/>
+                <w:webHidden/>
+              </w:rPr>
+              <w:t>6</w:t>
+            </w:r>
+            <w:r>
+              <w:rPr>
+                <w:noProof/>
+                <w:webHidden/>
+              </w:rPr>
+              <w:fldChar w:fldCharType="end"/>
+            </w:r>
+          </w:hyperlink>
+        </w:p>
+        <w:p>
+          <w:pPr>
+            <w:pStyle w:val="TOC2"/>
+            <w:tabs>
+              <w:tab w:val="left" w:pos="960"/>
+              <w:tab w:val="right" w:leader="dot" w:pos="9350"/>
+            </w:tabs>
+            <w:rPr>
+              <w:noProof/>
+            </w:rPr>
+          </w:pPr>
+          <w:hyperlink w:anchor="_Toc225619426" w:history="1">
+            <w:r>
+              <w:rPr>
+                <w:rStyle w:val="Hyperlink"/>
+                <w:noProof/>
+              </w:rPr>
+              <w:t>13.</w:t>
+            </w:r>
+            <w:r>
+              <w:rPr>
+                <w:noProof/>
+              </w:rPr>
+              <w:tab/>
+            </w:r>
+            <w:r>
+              <w:rPr>
+                <w:rStyle w:val="Hyperlink"/>
+                <w:noProof/>
+              </w:rPr>
+              <w:t>docker container prune</w:t>
+            </w:r>
+            <w:r>
+              <w:rPr>
+                <w:noProof/>
+                <w:webHidden/>
+              </w:rPr>
+              <w:tab/>
+            </w:r>
+            <w:r>
+              <w:rPr>
+                <w:noProof/>
+                <w:webHidden/>
+              </w:rPr>
+              <w:fldChar w:fldCharType="begin"/>
+            </w:r>
+            <w:r>
+              <w:rPr>
+                <w:noProof/>
+                <w:webHidden/>
+              </w:rPr>
+              <w:instrText xml:space="preserve"> PAGEREF _Toc225619426 \h </w:instrText>
+            </w:r>
+            <w:r>
+              <w:rPr>
+                <w:noProof/>
+                <w:webHidden/>
+              </w:rPr>
+            </w:r>
+            <w:r>
+              <w:rPr>
+                <w:noProof/>
+                <w:webHidden/>
+              </w:rPr>
+              <w:fldChar w:fldCharType="separate"/>
+            </w:r>
+            <w:r>
+              <w:rPr>
+                <w:noProof/>
+                <w:webHidden/>
+              </w:rPr>
+              <w:t>6</w:t>
+            </w:r>
+            <w:r>
+              <w:rPr>
+                <w:noProof/>
+                <w:webHidden/>
+              </w:rPr>
+              <w:fldChar w:fldCharType="end"/>
+            </w:r>
+          </w:hyperlink>
+        </w:p>
+        <w:p>
+          <w:pPr>
+            <w:pStyle w:val="TOC2"/>
+            <w:tabs>
+              <w:tab w:val="left" w:pos="960"/>
+              <w:tab w:val="right" w:leader="dot" w:pos="9350"/>
+            </w:tabs>
+            <w:rPr>
+              <w:noProof/>
+            </w:rPr>
+          </w:pPr>
+          <w:hyperlink w:anchor="_Toc225619427" w:history="1">
+            <w:r>
+              <w:rPr>
+                <w:rStyle w:val="Hyperlink"/>
+                <w:noProof/>
+              </w:rPr>
+              <w:t>14.</w:t>
+            </w:r>
+            <w:r>
+              <w:rPr>
+                <w:noProof/>
+              </w:rPr>
+              <w:tab/>
+            </w:r>
+            <w:r>
+              <w:rPr>
+                <w:rStyle w:val="Hyperlink"/>
+                <w:noProof/>
+              </w:rPr>
+              <w:t>docker rmi &lt;image_id&gt;</w:t>
+            </w:r>
+            <w:r>
+              <w:rPr>
+                <w:noProof/>
+                <w:webHidden/>
+              </w:rPr>
+              <w:tab/>
+            </w:r>
+            <w:r>
+              <w:rPr>
+                <w:noProof/>
+                <w:webHidden/>
+              </w:rPr>
+              <w:fldChar w:fldCharType="begin"/>
+            </w:r>
+            <w:r>
+              <w:rPr>
+                <w:noProof/>
+                <w:webHidden/>
+              </w:rPr>
+              <w:instrText xml:space="preserve"> PAGEREF _Toc225619427 \h </w:instrText>
+            </w:r>
+            <w:r>
+              <w:rPr>
+                <w:noProof/>
+                <w:webHidden/>
+              </w:rPr>
+            </w:r>
+            <w:r>
+              <w:rPr>
+                <w:noProof/>
+                <w:webHidden/>
+              </w:rPr>
+              <w:fldChar w:fldCharType="separate"/>
+            </w:r>
+            <w:r>
+              <w:rPr>
+                <w:noProof/>
+                <w:webHidden/>
+              </w:rPr>
+              <w:t>7</w:t>
+            </w:r>
+            <w:r>
+              <w:rPr>
+                <w:noProof/>
+                <w:webHidden/>
+              </w:rPr>
+              <w:fldChar w:fldCharType="end"/>
+            </w:r>
+          </w:hyperlink>
+        </w:p>
+        <w:p>
+          <w:pPr>
+            <w:pStyle w:val="TOC2"/>
+            <w:tabs>
+              <w:tab w:val="left" w:pos="960"/>
+              <w:tab w:val="right" w:leader="dot" w:pos="9350"/>
+            </w:tabs>
+            <w:rPr>
+              <w:noProof/>
+            </w:rPr>
+          </w:pPr>
+          <w:hyperlink w:anchor="_Toc225619428" w:history="1">
+            <w:r>
+              <w:rPr>
+                <w:rStyle w:val="Hyperlink"/>
+                <w:noProof/>
+              </w:rPr>
+              <w:t>15.</w:t>
+            </w:r>
+            <w:r>
+              <w:rPr>
+                <w:noProof/>
+              </w:rPr>
+              <w:tab/>
+            </w:r>
+            <w:r>
+              <w:rPr>
+                <w:rStyle w:val="Hyperlink"/>
+                <w:noProof/>
+              </w:rPr>
+              <w:t>docker image prune -a</w:t>
+            </w:r>
+            <w:r>
+              <w:rPr>
+                <w:noProof/>
+                <w:webHidden/>
+              </w:rPr>
+              <w:tab/>
+            </w:r>
+            <w:r>
+              <w:rPr>
+                <w:noProof/>
+                <w:webHidden/>
+              </w:rPr>
+              <w:fldChar w:fldCharType="begin"/>
+            </w:r>
+            <w:r>
+              <w:rPr>
+                <w:noProof/>
+                <w:webHidden/>
+              </w:rPr>
+              <w:instrText xml:space="preserve"> PAGEREF _Toc225619428 \h </w:instrText>
+            </w:r>
+            <w:r>
+              <w:rPr>
+                <w:noProof/>
+                <w:webHidden/>
+              </w:rPr>
+            </w:r>
+            <w:r>
+              <w:rPr>
+                <w:noProof/>
+                <w:webHidden/>
+              </w:rPr>
+              <w:fldChar w:fldCharType="separate"/>
+            </w:r>
+            <w:r>
+              <w:rPr>
+                <w:noProof/>
+                <w:webHidden/>
+              </w:rPr>
+              <w:t>7</w:t>
+            </w:r>
+            <w:r>
+              <w:rPr>
+                <w:noProof/>
+                <w:webHidden/>
+              </w:rPr>
+              <w:fldChar w:fldCharType="end"/>
+            </w:r>
+          </w:hyperlink>
+        </w:p>
+        <w:p>
+          <w:pPr>
+            <w:pStyle w:val="TOC2"/>
+            <w:tabs>
+              <w:tab w:val="left" w:pos="960"/>
+              <w:tab w:val="right" w:leader="dot" w:pos="9350"/>
+            </w:tabs>
+            <w:rPr>
+              <w:noProof/>
+            </w:rPr>
+          </w:pPr>
+          <w:hyperlink w:anchor="_Toc225619429" w:history="1">
+            <w:r>
+              <w:rPr>
+                <w:rStyle w:val="Hyperlink"/>
+                <w:noProof/>
+              </w:rPr>
+              <w:t>16.</w:t>
+            </w:r>
+            <w:r>
+              <w:rPr>
+                <w:noProof/>
+              </w:rPr>
+              <w:tab/>
+            </w:r>
+            <w:r>
+              <w:rPr>
+                <w:rStyle w:val="Hyperlink"/>
+                <w:noProof/>
+              </w:rPr>
+              <w:t>docker run -d -p 8080:80 nginx</w:t>
+            </w:r>
+            <w:r>
+              <w:rPr>
+                <w:noProof/>
+                <w:webHidden/>
+              </w:rPr>
+              <w:tab/>
+            </w:r>
+            <w:r>
+              <w:rPr>
+                <w:noProof/>
+                <w:webHidden/>
+              </w:rPr>
+              <w:fldChar w:fldCharType="begin"/>
+            </w:r>
+            <w:r>
+              <w:rPr>
+                <w:noProof/>
+                <w:webHidden/>
+              </w:rPr>
+              <w:instrText xml:space="preserve"> PAGEREF _Toc225619429 \h </w:instrText>
+            </w:r>
+            <w:r>
+              <w:rPr>
+                <w:noProof/>
+                <w:webHidden/>
+              </w:rPr>
+            </w:r>
+            <w:r>
+              <w:rPr>
+                <w:noProof/>
+                <w:webHidden/>
+              </w:rPr>
+              <w:fldChar w:fldCharType="separate"/>
+            </w:r>
+            <w:r>
+              <w:rPr>
+                <w:noProof/>
+                <w:webHidden/>
+              </w:rPr>
+              <w:t>8</w:t>
+            </w:r>
+            <w:r>
+              <w:rPr>
+                <w:noProof/>
+                <w:webHidden/>
+              </w:rPr>
+              <w:fldChar w:fldCharType="end"/>
+            </w:r>
+          </w:hyperlink>
+        </w:p>
+        <w:p>
+          <w:pPr>
+            <w:pStyle w:val="TOC2"/>
+            <w:tabs>
+              <w:tab w:val="left" w:pos="960"/>
+              <w:tab w:val="right" w:leader="dot" w:pos="9350"/>
+            </w:tabs>
+            <w:rPr>
+              <w:noProof/>
+            </w:rPr>
+          </w:pPr>
+          <w:hyperlink w:anchor="_Toc225619430" w:history="1">
+            <w:r>
+              <w:rPr>
+                <w:rStyle w:val="Hyperlink"/>
+                <w:noProof/>
+              </w:rPr>
+              <w:t>17.</w:t>
+            </w:r>
+            <w:r>
+              <w:rPr>
+                <w:noProof/>
+              </w:rPr>
+              <w:tab/>
+            </w:r>
+            <w:r>
+              <w:rPr>
+                <w:rStyle w:val="Hyperlink"/>
+                <w:noProof/>
+              </w:rPr>
+              <w:t>docker inspect &lt;container_id&gt;</w:t>
+            </w:r>
+            <w:r>
+              <w:rPr>
+                <w:noProof/>
+                <w:webHidden/>
+              </w:rPr>
+              <w:tab/>
+            </w:r>
+            <w:r>
+              <w:rPr>
+                <w:noProof/>
+                <w:webHidden/>
+              </w:rPr>
+              <w:fldChar w:fldCharType="begin"/>
+            </w:r>
+            <w:r>
+              <w:rPr>
+                <w:noProof/>
+                <w:webHidden/>
+              </w:rPr>
+              <w:instrText xml:space="preserve"> PAGEREF _Toc225619430 \h </w:instrText>
+            </w:r>
+            <w:r>
+              <w:rPr>
+                <w:noProof/>
+                <w:webHidden/>
+              </w:rPr>
+            </w:r>
+            <w:r>
+              <w:rPr>
+                <w:noProof/>
+                <w:webHidden/>
+              </w:rPr>
+              <w:fldChar w:fldCharType="separate"/>
+            </w:r>
+            <w:r>
+              <w:rPr>
+                <w:noProof/>
+                <w:webHidden/>
+              </w:rPr>
+              <w:t>9</w:t>
+            </w:r>
+            <w:r>
+              <w:rPr>
+                <w:noProof/>
+                <w:webHidden/>
+              </w:rPr>
+              <w:fldChar w:fldCharType="end"/>
+            </w:r>
+          </w:hyperlink>
+        </w:p>
+        <w:p>
+          <w:pPr>
+            <w:pStyle w:val="TOC2"/>
+            <w:tabs>
+              <w:tab w:val="left" w:pos="960"/>
+              <w:tab w:val="right" w:leader="dot" w:pos="9350"/>
+            </w:tabs>
+            <w:rPr>
+              <w:noProof/>
+            </w:rPr>
+          </w:pPr>
+          <w:hyperlink w:anchor="_Toc225619431" w:history="1">
+            <w:r>
+              <w:rPr>
+                <w:rStyle w:val="Hyperlink"/>
+                <w:noProof/>
+              </w:rPr>
+              <w:t>18.</w:t>
+            </w:r>
+            <w:r>
+              <w:rPr>
+                <w:noProof/>
+              </w:rPr>
+              <w:tab/>
+            </w:r>
+            <w:r>
+              <w:rPr>
+                <w:rStyle w:val="Hyperlink"/>
+                <w:noProof/>
+              </w:rPr>
+              <w:t>docker run -d -v mydata:/data nginx</w:t>
+            </w:r>
+            <w:r>
+              <w:rPr>
+                <w:noProof/>
+                <w:webHidden/>
+              </w:rPr>
+              <w:tab/>
+            </w:r>
+            <w:r>
+              <w:rPr>
+                <w:noProof/>
+                <w:webHidden/>
+              </w:rPr>
+              <w:fldChar w:fldCharType="begin"/>
+            </w:r>
+            <w:r>
+              <w:rPr>
+                <w:noProof/>
+                <w:webHidden/>
+              </w:rPr>
+              <w:instrText xml:space="preserve"> PAGEREF _Toc225619431 \h </w:instrText>
+            </w:r>
+            <w:r>
+              <w:rPr>
+                <w:noProof/>
+                <w:webHidden/>
+              </w:rPr>
+            </w:r>
+            <w:r>
+              <w:rPr>
+                <w:noProof/>
+                <w:webHidden/>
+              </w:rPr>
+              <w:fldChar w:fldCharType="separate"/>
+            </w:r>
+            <w:r>
+              <w:rPr>
+                <w:noProof/>
+                <w:webHidden/>
+              </w:rPr>
+              <w:t>9</w:t>
+            </w:r>
+            <w:r>
+              <w:rPr>
+                <w:noProof/>
+                <w:webHidden/>
+              </w:rPr>
+              <w:fldChar w:fldCharType="end"/>
+            </w:r>
+          </w:hyperlink>
+        </w:p>
+        <w:p>
+          <w:pPr>
+            <w:pStyle w:val="TOC2"/>
+            <w:tabs>
+              <w:tab w:val="left" w:pos="960"/>
+              <w:tab w:val="right" w:leader="dot" w:pos="9350"/>
+            </w:tabs>
+            <w:rPr>
+              <w:noProof/>
+            </w:rPr>
+          </w:pPr>
+          <w:hyperlink w:anchor="_Toc225619432" w:history="1">
+            <w:r>
+              <w:rPr>
+                <w:rStyle w:val="Hyperlink"/>
+                <w:noProof/>
+              </w:rPr>
+              <w:t>19.</w:t>
+            </w:r>
+            <w:r>
+              <w:rPr>
+                <w:noProof/>
+              </w:rPr>
+              <w:tab/>
+            </w:r>
+            <w:r>
+              <w:rPr>
+                <w:rStyle w:val="Hyperlink"/>
+                <w:noProof/>
+              </w:rPr>
+              <w:t>docker volume ls</w:t>
+            </w:r>
+            <w:r>
+              <w:rPr>
+                <w:noProof/>
+                <w:webHidden/>
+              </w:rPr>
+              <w:tab/>
+            </w:r>
+            <w:r>
+              <w:rPr>
+                <w:noProof/>
+                <w:webHidden/>
+              </w:rPr>
+              <w:fldChar w:fldCharType="begin"/>
+            </w:r>
+            <w:r>
+              <w:rPr>
+                <w:noProof/>
+                <w:webHidden/>
+              </w:rPr>
+              <w:instrText xml:space="preserve"> PAGEREF _Toc225619432 \h </w:instrText>
+            </w:r>
+            <w:r>
+              <w:rPr>
+                <w:noProof/>
+                <w:webHidden/>
+              </w:rPr>
+            </w:r>
+            <w:r>
+              <w:rPr>
+                <w:noProof/>
+                <w:webHidden/>
+              </w:rPr>
+              <w:fldChar w:fldCharType="separate"/>
+            </w:r>
+            <w:r>
+              <w:rPr>
+                <w:noProof/>
+                <w:webHidden/>
+              </w:rPr>
+              <w:t>9</w:t>
+            </w:r>
+            <w:r>
+              <w:rPr>
+                <w:noProof/>
+                <w:webHidden/>
+              </w:rPr>
+              <w:fldChar w:fldCharType="end"/>
+            </w:r>
+          </w:hyperlink>
+        </w:p>
+        <w:p>
+          <w:pPr>
+            <w:pStyle w:val="TOC2"/>
+            <w:tabs>
+              <w:tab w:val="left" w:pos="960"/>
+              <w:tab w:val="right" w:leader="dot" w:pos="9350"/>
+            </w:tabs>
+            <w:rPr>
+              <w:noProof/>
+            </w:rPr>
+          </w:pPr>
+          <w:hyperlink w:anchor="_Toc225619433" w:history="1">
+            <w:r>
+              <w:rPr>
+                <w:rStyle w:val="Hyperlink"/>
+                <w:noProof/>
+              </w:rPr>
+              <w:t>20.</w:t>
+            </w:r>
+            <w:r>
+              <w:rPr>
+                <w:noProof/>
+              </w:rPr>
+              <w:tab/>
+            </w:r>
+            <w:r>
+              <w:rPr>
+                <w:rStyle w:val="Hyperlink"/>
+                <w:noProof/>
+              </w:rPr>
+              <w:t>docker volume prune</w:t>
+            </w:r>
+            <w:r>
+              <w:rPr>
+                <w:noProof/>
+                <w:webHidden/>
+              </w:rPr>
+              <w:tab/>
+            </w:r>
+            <w:r>
+              <w:rPr>
+                <w:noProof/>
+                <w:webHidden/>
+              </w:rPr>
+              <w:fldChar w:fldCharType="begin"/>
+            </w:r>
+            <w:r>
+              <w:rPr>
+                <w:noProof/>
+                <w:webHidden/>
+              </w:rPr>
+              <w:instrText xml:space="preserve"> PAGEREF _Toc225619433 \h </w:instrText>
+            </w:r>
+            <w:r>
+              <w:rPr>
+                <w:noProof/>
+                <w:webHidden/>
+              </w:rPr>
+            </w:r>
+            <w:r>
+              <w:rPr>
+                <w:noProof/>
+                <w:webHidden/>
+              </w:rPr>
+              <w:fldChar w:fldCharType="separate"/>
+            </w:r>
+            <w:r>
+              <w:rPr>
+                <w:noProof/>
+                <w:webHidden/>
+              </w:rPr>
+              <w:t>9</w:t>
+            </w:r>
+            <w:r>
+              <w:rPr>
+                <w:noProof/>
+                <w:webHidden/>
+              </w:rPr>
+              <w:fldChar w:fldCharType="end"/>
+            </w:r>
+          </w:hyperlink>
+        </w:p>
+        <w:p>
+          <w:pPr>
+            <w:pStyle w:val="TOC2"/>
+            <w:tabs>
+              <w:tab w:val="left" w:pos="960"/>
+              <w:tab w:val="right" w:leader="dot" w:pos="9350"/>
+            </w:tabs>
+            <w:rPr>
+              <w:noProof/>
+            </w:rPr>
+          </w:pPr>
+          <w:hyperlink w:anchor="_Toc225619434" w:history="1">
+            <w:r>
+              <w:rPr>
+                <w:rStyle w:val="Hyperlink"/>
+                <w:noProof/>
+              </w:rPr>
+              <w:t>21.</w:t>
+            </w:r>
+            <w:r>
+              <w:rPr>
+                <w:noProof/>
+              </w:rPr>
+              <w:tab/>
+            </w:r>
+            <w:r>
+              <w:rPr>
+                <w:rStyle w:val="Hyperlink"/>
+                <w:noProof/>
+              </w:rPr>
+              <w:t>docker run -d --name my_nginx nginx</w:t>
+            </w:r>
+            <w:r>
+              <w:rPr>
+                <w:noProof/>
+                <w:webHidden/>
+              </w:rPr>
+              <w:tab/>
+            </w:r>
+            <w:r>
+              <w:rPr>
+                <w:noProof/>
+                <w:webHidden/>
+              </w:rPr>
+              <w:fldChar w:fldCharType="begin"/>
+            </w:r>
+            <w:r>
+              <w:rPr>
+                <w:noProof/>
+                <w:webHidden/>
+              </w:rPr>
+              <w:instrText xml:space="preserve"> PAGEREF _Toc225619434 \h </w:instrText>
+            </w:r>
+            <w:r>
+              <w:rPr>
+                <w:noProof/>
+                <w:webHidden/>
+              </w:rPr>
+            </w:r>
+            <w:r>
+              <w:rPr>
+                <w:noProof/>
+                <w:webHidden/>
+              </w:rPr>
+              <w:fldChar w:fldCharType="separate"/>
+            </w:r>
+            <w:r>
+              <w:rPr>
+                <w:noProof/>
+                <w:webHidden/>
+              </w:rPr>
+              <w:t>10</w:t>
+            </w:r>
+            <w:r>
+              <w:rPr>
+                <w:noProof/>
+                <w:webHidden/>
+              </w:rPr>
+              <w:fldChar w:fldCharType="end"/>
+            </w:r>
+          </w:hyperlink>
+        </w:p>
+        <w:p>
+          <w:pPr>
+            <w:pStyle w:val="TOC2"/>
+            <w:tabs>
+              <w:tab w:val="left" w:pos="960"/>
+              <w:tab w:val="right" w:leader="dot" w:pos="9350"/>
+            </w:tabs>
+            <w:rPr>
+              <w:noProof/>
+            </w:rPr>
+          </w:pPr>
+          <w:hyperlink w:anchor="_Toc225619435" w:history="1">
+            <w:r>
+              <w:rPr>
+                <w:rStyle w:val="Hyperlink"/>
+                <w:noProof/>
+              </w:rPr>
+              <w:t>22.</w:t>
+            </w:r>
+            <w:r>
+              <w:rPr>
+                <w:noProof/>
+              </w:rPr>
+              <w:tab/>
+            </w:r>
+            <w:r>
+              <w:rPr>
+                <w:rStyle w:val="Hyperlink"/>
+                <w:noProof/>
+              </w:rPr>
+              <w:t>docker stats</w:t>
+            </w:r>
+            <w:r>
+              <w:rPr>
+                <w:noProof/>
+                <w:webHidden/>
+              </w:rPr>
+              <w:tab/>
+            </w:r>
+            <w:r>
+              <w:rPr>
+                <w:noProof/>
+                <w:webHidden/>
+              </w:rPr>
+              <w:fldChar w:fldCharType="begin"/>
+            </w:r>
+            <w:r>
+              <w:rPr>
+                <w:noProof/>
+                <w:webHidden/>
+              </w:rPr>
+              <w:instrText xml:space="preserve"> PAGEREF _Toc225619435 \h </w:instrText>
+            </w:r>
+            <w:r>
+              <w:rPr>
+                <w:noProof/>
+                <w:webHidden/>
+              </w:rPr>
+            </w:r>
+            <w:r>
+              <w:rPr>
+                <w:noProof/>
+                <w:webHidden/>
+              </w:rPr>
+              <w:fldChar w:fldCharType="separate"/>
+            </w:r>
+            <w:r>
+              <w:rPr>
+                <w:noProof/>
+                <w:webHidden/>
+              </w:rPr>
+              <w:t>10</w:t>
+            </w:r>
+            <w:r>
+              <w:rPr>
+                <w:noProof/>
+                <w:webHidden/>
+              </w:rPr>
+              <w:fldChar w:fldCharType="end"/>
+            </w:r>
+          </w:hyperlink>
+        </w:p>
+        <w:p>
+          <w:pPr>
+            <w:pStyle w:val="TOC2"/>
+            <w:tabs>
+              <w:tab w:val="left" w:pos="960"/>
+              <w:tab w:val="right" w:leader="dot" w:pos="9350"/>
+            </w:tabs>
+            <w:rPr>
+              <w:noProof/>
+            </w:rPr>
+          </w:pPr>
+          <w:hyperlink w:anchor="_Toc225619436" w:history="1">
+            <w:r>
+              <w:rPr>
+                <w:rStyle w:val="Hyperlink"/>
+                <w:noProof/>
+              </w:rPr>
+              <w:t>23.</w:t>
+            </w:r>
+            <w:r>
+              <w:rPr>
+                <w:noProof/>
+              </w:rPr>
+              <w:tab/>
+            </w:r>
+            <w:r>
+              <w:rPr>
+                <w:rStyle w:val="Hyperlink"/>
+                <w:noProof/>
+              </w:rPr>
+              <w:t>docker network ls</w:t>
+            </w:r>
+            <w:r>
+              <w:rPr>
+                <w:noProof/>
+                <w:webHidden/>
+              </w:rPr>
+              <w:tab/>
+            </w:r>
+            <w:r>
+              <w:rPr>
+                <w:noProof/>
+                <w:webHidden/>
+              </w:rPr>
+              <w:fldChar w:fldCharType="begin"/>
+            </w:r>
+            <w:r>
+              <w:rPr>
+                <w:noProof/>
+                <w:webHidden/>
+              </w:rPr>
+              <w:instrText xml:space="preserve"> PAGEREF _Toc225619436 \h </w:instrText>
+            </w:r>
+            <w:r>
+              <w:rPr>
+                <w:noProof/>
+                <w:webHidden/>
+              </w:rPr>
+            </w:r>
+            <w:r>
+              <w:rPr>
+                <w:noProof/>
+                <w:webHidden/>
+              </w:rPr>
+              <w:fldChar w:fldCharType="separate"/>
+            </w:r>
+            <w:r>
+              <w:rPr>
+                <w:noProof/>
+                <w:webHidden/>
+              </w:rPr>
+              <w:t>10</w:t>
+            </w:r>
+            <w:r>
+              <w:rPr>
+                <w:noProof/>
+                <w:webHidden/>
+              </w:rPr>
+              <w:fldChar w:fldCharType="end"/>
+            </w:r>
+          </w:hyperlink>
+        </w:p>
+        <w:p>
+          <w:pPr>
+            <w:pStyle w:val="TOC2"/>
+            <w:tabs>
+              <w:tab w:val="left" w:pos="960"/>
+              <w:tab w:val="right" w:leader="dot" w:pos="9350"/>
+            </w:tabs>
+            <w:rPr>
+              <w:noProof/>
+            </w:rPr>
+          </w:pPr>
+          <w:hyperlink w:anchor="_Toc225619437" w:history="1">
+            <w:r>
+              <w:rPr>
+                <w:rStyle w:val="Hyperlink"/>
+                <w:noProof/>
+              </w:rPr>
+              <w:t>24.</w:t>
+            </w:r>
+            <w:r>
+              <w:rPr>
+                <w:noProof/>
+              </w:rPr>
+              <w:tab/>
+            </w:r>
+            <w:r>
+              <w:rPr>
+                <w:rStyle w:val="Hyperlink"/>
+                <w:noProof/>
+              </w:rPr>
+              <w:t>docker network create my_network</w:t>
+            </w:r>
+            <w:r>
+              <w:rPr>
+                <w:noProof/>
+                <w:webHidden/>
+              </w:rPr>
+              <w:tab/>
+            </w:r>
+            <w:r>
+              <w:rPr>
+                <w:noProof/>
+                <w:webHidden/>
+              </w:rPr>
+              <w:fldChar w:fldCharType="begin"/>
+            </w:r>
+            <w:r>
+              <w:rPr>
+                <w:noProof/>
+                <w:webHidden/>
+              </w:rPr>
+              <w:instrText xml:space="preserve"> PAGEREF _Toc225619437 \h </w:instrText>
+            </w:r>
+            <w:r>
+              <w:rPr>
+                <w:noProof/>
+                <w:webHidden/>
+              </w:rPr>
+            </w:r>
+            <w:r>
+              <w:rPr>
+                <w:noProof/>
+                <w:webHidden/>
+              </w:rPr>
+              <w:fldChar w:fldCharType="separate"/>
+            </w:r>
+            <w:r>
+              <w:rPr>
+                <w:noProof/>
+                <w:webHidden/>
+              </w:rPr>
+              <w:t>10</w:t>
+            </w:r>
+            <w:r>
+              <w:rPr>
+                <w:noProof/>
+                <w:webHidden/>
+              </w:rPr>
+              <w:fldChar w:fldCharType="end"/>
+            </w:r>
+          </w:hyperlink>
+        </w:p>
+        <w:p>
+          <w:pPr>
+            <w:pStyle w:val="TOC2"/>
+            <w:tabs>
+              <w:tab w:val="left" w:pos="960"/>
+              <w:tab w:val="right" w:leader="dot" w:pos="9350"/>
+            </w:tabs>
+            <w:rPr>
+              <w:noProof/>
+            </w:rPr>
+          </w:pPr>
+          <w:hyperlink w:anchor="_Toc225619438" w:history="1">
+            <w:r>
+              <w:rPr>
+                <w:rStyle w:val="Hyperlink"/>
+                <w:noProof/>
+              </w:rPr>
+              <w:t>25.</w:t>
+            </w:r>
+            <w:r>
+              <w:rPr>
+                <w:noProof/>
+              </w:rPr>
+              <w:tab/>
+            </w:r>
+            <w:r>
+              <w:rPr>
+                <w:rStyle w:val="Hyperlink"/>
+                <w:noProof/>
+              </w:rPr>
+              <w:t>docker run -d --network my_network --name my_container nginx</w:t>
+            </w:r>
+            <w:r>
+              <w:rPr>
+                <w:noProof/>
+                <w:webHidden/>
+              </w:rPr>
+              <w:tab/>
+            </w:r>
+            <w:r>
+              <w:rPr>
+                <w:noProof/>
+                <w:webHidden/>
+              </w:rPr>
+              <w:fldChar w:fldCharType="begin"/>
+            </w:r>
+            <w:r>
+              <w:rPr>
+                <w:noProof/>
+                <w:webHidden/>
+              </w:rPr>
+              <w:instrText xml:space="preserve"> PAGEREF _Toc225619438 \h </w:instrText>
+            </w:r>
+            <w:r>
+              <w:rPr>
+                <w:noProof/>
+                <w:webHidden/>
+              </w:rPr>
+            </w:r>
+            <w:r>
+              <w:rPr>
+                <w:noProof/>
+                <w:webHidden/>
+              </w:rPr>
+              <w:fldChar w:fldCharType="separate"/>
+            </w:r>
+            <w:r>
+              <w:rPr>
+                <w:noProof/>
+                <w:webHidden/>
+              </w:rPr>
+              <w:t>11</w:t>
+            </w:r>
+            <w:r>
+              <w:rPr>
+                <w:noProof/>
+                <w:webHidden/>
+              </w:rPr>
+              <w:fldChar w:fldCharType="end"/>
+            </w:r>
+          </w:hyperlink>
+        </w:p>
+        <w:p>
+          <w:pPr>
+            <w:pStyle w:val="TOC2"/>
+            <w:tabs>
+              <w:tab w:val="left" w:pos="960"/>
+              <w:tab w:val="right" w:leader="dot" w:pos="9350"/>
+            </w:tabs>
+            <w:rPr>
+              <w:noProof/>
+            </w:rPr>
+          </w:pPr>
+          <w:hyperlink w:anchor="_Toc225619439" w:history="1">
+            <w:r>
+              <w:rPr>
+                <w:rStyle w:val="Hyperlink"/>
+                <w:noProof/>
+              </w:rPr>
+              <w:t>26.</w:t>
+            </w:r>
+            <w:r>
+              <w:rPr>
+                <w:noProof/>
+              </w:rPr>
+              <w:tab/>
+            </w:r>
+            <w:r>
+              <w:rPr>
+                <w:rStyle w:val="Hyperlink"/>
+                <w:noProof/>
+              </w:rPr>
+              <w:t>docker network connect my_network my_nginx</w:t>
+            </w:r>
+            <w:r>
+              <w:rPr>
+                <w:noProof/>
+                <w:webHidden/>
+              </w:rPr>
+              <w:tab/>
+            </w:r>
+            <w:r>
+              <w:rPr>
+                <w:noProof/>
+                <w:webHidden/>
+              </w:rPr>
+              <w:fldChar w:fldCharType="begin"/>
+            </w:r>
+            <w:r>
+              <w:rPr>
+                <w:noProof/>
+                <w:webHidden/>
+              </w:rPr>
+              <w:instrText xml:space="preserve"> PAGEREF _Toc225619439 \h </w:instrText>
+            </w:r>
+            <w:r>
+              <w:rPr>
+                <w:noProof/>
+                <w:webHidden/>
+              </w:rPr>
+            </w:r>
+            <w:r>
+              <w:rPr>
+                <w:noProof/>
+                <w:webHidden/>
+              </w:rPr>
+              <w:fldChar w:fldCharType="separate"/>
+            </w:r>
+            <w:r>
+              <w:rPr>
+                <w:noProof/>
+                <w:webHidden/>
+              </w:rPr>
+              <w:t>11</w:t>
+            </w:r>
+            <w:r>
+              <w:rPr>
+                <w:noProof/>
+                <w:webHidden/>
+              </w:rPr>
+              <w:fldChar w:fldCharType="end"/>
+            </w:r>
+          </w:hyperlink>
+        </w:p>
+        <w:p>
+          <w:pPr>
+            <w:pStyle w:val="TOC2"/>
+            <w:tabs>
+              <w:tab w:val="left" w:pos="960"/>
+              <w:tab w:val="right" w:leader="dot" w:pos="9350"/>
+            </w:tabs>
+            <w:rPr>
+              <w:noProof/>
+            </w:rPr>
+          </w:pPr>
+          <w:hyperlink w:anchor="_Toc225619440" w:history="1">
+            <w:r>
+              <w:rPr>
+                <w:rStyle w:val="Hyperlink"/>
+                <w:noProof/>
+              </w:rPr>
+              <w:t>27.</w:t>
+            </w:r>
+            <w:r>
+              <w:rPr>
+                <w:noProof/>
+              </w:rPr>
+              <w:tab/>
+            </w:r>
+            <w:r>
+              <w:rPr>
+                <w:rStyle w:val="Hyperlink"/>
+                <w:noProof/>
+              </w:rPr>
+              <w:t>docker run -d -e MY_ENV=hello_world nginx</w:t>
+            </w:r>
+            <w:r>
+              <w:rPr>
+                <w:noProof/>
+                <w:webHidden/>
+              </w:rPr>
+              <w:tab/>
+            </w:r>
+            <w:r>
+              <w:rPr>
+                <w:noProof/>
+                <w:webHidden/>
+              </w:rPr>
+              <w:fldChar w:fldCharType="begin"/>
+            </w:r>
+            <w:r>
+              <w:rPr>
+                <w:noProof/>
+                <w:webHidden/>
+              </w:rPr>
+              <w:instrText xml:space="preserve"> PAGEREF _Toc225619440 \h </w:instrText>
+            </w:r>
+            <w:r>
+              <w:rPr>
+                <w:noProof/>
+                <w:webHidden/>
+              </w:rPr>
+            </w:r>
+            <w:r>
+              <w:rPr>
+                <w:noProof/>
+                <w:webHidden/>
+              </w:rPr>
+              <w:fldChar w:fldCharType="separate"/>
+            </w:r>
+            <w:r>
+              <w:rPr>
+                <w:noProof/>
+                <w:webHidden/>
+              </w:rPr>
+              <w:t>11</w:t>
+            </w:r>
+            <w:r>
+              <w:rPr>
+                <w:noProof/>
+                <w:webHidden/>
+              </w:rPr>
+              <w:fldChar w:fldCharType="end"/>
+            </w:r>
+          </w:hyperlink>
+        </w:p>
+        <w:p>
+          <w:pPr>
+            <w:pStyle w:val="TOC2"/>
+            <w:tabs>
+              <w:tab w:val="left" w:pos="960"/>
+              <w:tab w:val="right" w:leader="dot" w:pos="9350"/>
+            </w:tabs>
+            <w:rPr>
+              <w:noProof/>
+            </w:rPr>
+          </w:pPr>
+          <w:hyperlink w:anchor="_Toc225619441" w:history="1">
+            <w:r>
+              <w:rPr>
+                <w:rStyle w:val="Hyperlink"/>
+                <w:noProof/>
+              </w:rPr>
+              <w:t>28.</w:t>
+            </w:r>
+            <w:r>
+              <w:rPr>
+                <w:noProof/>
+              </w:rPr>
+              <w:tab/>
+            </w:r>
+            <w:r>
+              <w:rPr>
+                <w:rStyle w:val="Hyperlink"/>
+                <w:noProof/>
+              </w:rPr>
+              <w:t>docker logs -f my_nginx</w:t>
+            </w:r>
+            <w:r>
+              <w:rPr>
+                <w:noProof/>
+                <w:webHidden/>
+              </w:rPr>
+              <w:tab/>
+            </w:r>
+            <w:r>
+              <w:rPr>
+                <w:noProof/>
+                <w:webHidden/>
+              </w:rPr>
+              <w:fldChar w:fldCharType="begin"/>
+            </w:r>
+            <w:r>
+              <w:rPr>
+                <w:noProof/>
+                <w:webHidden/>
+              </w:rPr>
+              <w:instrText xml:space="preserve"> PAGEREF _Toc225619441 \h </w:instrText>
+            </w:r>
+            <w:r>
+              <w:rPr>
+                <w:noProof/>
+                <w:webHidden/>
+              </w:rPr>
+            </w:r>
+            <w:r>
+              <w:rPr>
+                <w:noProof/>
+                <w:webHidden/>
+              </w:rPr>
+              <w:fldChar w:fldCharType="separate"/>
+            </w:r>
+            <w:r>
+              <w:rPr>
+                <w:noProof/>
+                <w:webHidden/>
+              </w:rPr>
+              <w:t>12</w:t>
+            </w:r>
+            <w:r>
+              <w:rPr>
+                <w:noProof/>
+                <w:webHidden/>
+              </w:rPr>
+              <w:fldChar w:fldCharType="end"/>
+            </w:r>
+          </w:hyperlink>
+        </w:p>
+        <w:p>
+          <w:pPr>
+            <w:pStyle w:val="TOC2"/>
+            <w:tabs>
+              <w:tab w:val="left" w:pos="960"/>
+              <w:tab w:val="right" w:leader="dot" w:pos="9350"/>
+            </w:tabs>
+            <w:rPr>
+              <w:noProof/>
+            </w:rPr>
+          </w:pPr>
+          <w:hyperlink w:anchor="_Toc225619442" w:history="1">
+            <w:r>
+              <w:rPr>
+                <w:rStyle w:val="Hyperlink"/>
+                <w:noProof/>
+              </w:rPr>
+              <w:t>29.</w:t>
+            </w:r>
+            <w:r>
+              <w:rPr>
+                <w:noProof/>
+              </w:rPr>
+              <w:tab/>
+            </w:r>
+            <w:r>
+              <w:rPr>
+                <w:rStyle w:val="Hyperlink"/>
+                <w:noProof/>
+              </w:rPr>
+              <w:t>FROM nginx COPY index.html /usr/share/nginx/html/index.html</w:t>
+            </w:r>
+            <w:r>
+              <w:rPr>
+                <w:noProof/>
+                <w:webHidden/>
+              </w:rPr>
+              <w:tab/>
+            </w:r>
+            <w:r>
+              <w:rPr>
+                <w:noProof/>
+                <w:webHidden/>
+              </w:rPr>
+              <w:fldChar w:fldCharType="begin"/>
+            </w:r>
+            <w:r>
+              <w:rPr>
+                <w:noProof/>
+                <w:webHidden/>
+              </w:rPr>
+              <w:instrText xml:space="preserve"> PAGEREF _Toc225619442 \h </w:instrText>
+            </w:r>
+            <w:r>
+              <w:rPr>
+                <w:noProof/>
+                <w:webHidden/>
+              </w:rPr>
+            </w:r>
+            <w:r>
+              <w:rPr>
+                <w:noProof/>
+                <w:webHidden/>
+              </w:rPr>
+              <w:fldChar w:fldCharType="separate"/>
+            </w:r>
+            <w:r>
+              <w:rPr>
+                <w:noProof/>
+                <w:webHidden/>
+              </w:rPr>
+              <w:t>12</w:t>
+            </w:r>
+            <w:r>
+              <w:rPr>
+                <w:noProof/>
+                <w:webHidden/>
+              </w:rPr>
+              <w:fldChar w:fldCharType="end"/>
+            </w:r>
+          </w:hyperlink>
+        </w:p>
+        <w:p>
+          <w:pPr>
+            <w:pStyle w:val="TOC2"/>
+            <w:tabs>
+              <w:tab w:val="left" w:pos="960"/>
+              <w:tab w:val="right" w:leader="dot" w:pos="9350"/>
+            </w:tabs>
+            <w:rPr>
+              <w:noProof/>
+            </w:rPr>
+          </w:pPr>
+          <w:hyperlink w:anchor="_Toc225619443" w:history="1">
+            <w:r>
+              <w:rPr>
+                <w:rStyle w:val="Hyperlink"/>
+                <w:noProof/>
+              </w:rPr>
+              <w:t>30.</w:t>
+            </w:r>
+            <w:r>
+              <w:rPr>
+                <w:noProof/>
+              </w:rPr>
+              <w:tab/>
+            </w:r>
+            <w:r>
+              <w:rPr>
+                <w:rStyle w:val="Hyperlink"/>
+                <w:noProof/>
+              </w:rPr>
+              <w:t>docker build -t my_nginx_image .</w:t>
+            </w:r>
+            <w:r>
+              <w:rPr>
+                <w:noProof/>
+                <w:webHidden/>
+              </w:rPr>
+              <w:tab/>
+            </w:r>
+            <w:r>
+              <w:rPr>
+                <w:noProof/>
+                <w:webHidden/>
+              </w:rPr>
+              <w:fldChar w:fldCharType="begin"/>
+            </w:r>
+            <w:r>
+              <w:rPr>
+                <w:noProof/>
+                <w:webHidden/>
+              </w:rPr>
+              <w:instrText xml:space="preserve"> PAGEREF _Toc225619443 \h </w:instrText>
+            </w:r>
+            <w:r>
+              <w:rPr>
+                <w:noProof/>
+                <w:webHidden/>
+              </w:rPr>
+            </w:r>
+            <w:r>
+              <w:rPr>
+                <w:noProof/>
+                <w:webHidden/>
+              </w:rPr>
+              <w:fldChar w:fldCharType="separate"/>
+            </w:r>
+            <w:r>
+              <w:rPr>
+                <w:noProof/>
+                <w:webHidden/>
+              </w:rPr>
+              <w:t>13</w:t>
+            </w:r>
+            <w:r>
+              <w:rPr>
+                <w:noProof/>
+                <w:webHidden/>
+              </w:rPr>
+              <w:fldChar w:fldCharType="end"/>
+            </w:r>
+          </w:hyperlink>
+        </w:p>
+        <w:p>
+          <w:pPr>
+            <w:pStyle w:val="TOC2"/>
+            <w:tabs>
+              <w:tab w:val="left" w:pos="960"/>
+              <w:tab w:val="right" w:leader="dot" w:pos="9350"/>
+            </w:tabs>
+            <w:rPr>
+              <w:noProof/>
+            </w:rPr>
+          </w:pPr>
+          <w:hyperlink w:anchor="_Toc225619444" w:history="1">
+            <w:r>
+              <w:rPr>
+                <w:rStyle w:val="Hyperlink"/>
+                <w:noProof/>
+              </w:rPr>
+              <w:t>31.</w:t>
+            </w:r>
+            <w:r>
+              <w:rPr>
+                <w:noProof/>
+              </w:rPr>
+              <w:tab/>
+            </w:r>
+            <w:r>
+              <w:rPr>
+                <w:rStyle w:val="Hyperlink"/>
+                <w:noProof/>
+              </w:rPr>
+              <w:t>docker run -d -p 8080:80 my_nginx_image</w:t>
+            </w:r>
+            <w:r>
+              <w:rPr>
+                <w:noProof/>
+                <w:webHidden/>
+              </w:rPr>
+              <w:tab/>
+            </w:r>
+            <w:r>
+              <w:rPr>
+                <w:noProof/>
+                <w:webHidden/>
+              </w:rPr>
+              <w:fldChar w:fldCharType="begin"/>
+            </w:r>
+            <w:r>
+              <w:rPr>
+                <w:noProof/>
+                <w:webHidden/>
+              </w:rPr>
+              <w:instrText xml:space="preserve"> PAGEREF _Toc225619444 \h </w:instrText>
+            </w:r>
+            <w:r>
+              <w:rPr>
+                <w:noProof/>
+                <w:webHidden/>
+              </w:rPr>
+            </w:r>
+            <w:r>
+              <w:rPr>
+                <w:noProof/>
+                <w:webHidden/>
+              </w:rPr>
+              <w:fldChar w:fldCharType="separate"/>
+            </w:r>
+            <w:r>
+              <w:rPr>
+                <w:noProof/>
+                <w:webHidden/>
+              </w:rPr>
+              <w:t>13</w:t>
+            </w:r>
+            <w:r>
+              <w:rPr>
+                <w:noProof/>
+                <w:webHidden/>
+              </w:rPr>
+              <w:fldChar w:fldCharType="end"/>
+            </w:r>
+          </w:hyperlink>
+        </w:p>
+        <w:p>
+          <w:pPr>
+            <w:pStyle w:val="TOC1"/>
+            <w:tabs>
+              <w:tab w:val="left" w:pos="480"/>
+              <w:tab w:val="right" w:leader="dot" w:pos="9350"/>
+            </w:tabs>
+            <w:rPr>
+              <w:noProof/>
+            </w:rPr>
+          </w:pPr>
+          <w:hyperlink w:anchor="_Toc225619445" w:history="1">
+            <w:r>
+              <w:rPr>
+                <w:rStyle w:val="Hyperlink"/>
+                <w:noProof/>
+              </w:rPr>
+              <w:t>II.</w:t>
+            </w:r>
+            <w:r>
+              <w:rPr>
+                <w:noProof/>
+              </w:rPr>
+              <w:tab/>
+            </w:r>
+            <w:r>
+              <w:rPr>
+                <w:rStyle w:val="Hyperlink"/>
+                <w:noProof/>
+              </w:rPr>
+              <w:t>Thao tác với Dockerfile</w:t>
+            </w:r>
+            <w:r>
+              <w:rPr>
+                <w:noProof/>
+                <w:webHidden/>
+              </w:rPr>
+              <w:tab/>
+            </w:r>
+            <w:r>
+              <w:rPr>
+                <w:noProof/>
+                <w:webHidden/>
+              </w:rPr>
+              <w:fldChar w:fldCharType="begin"/>
+            </w:r>
+            <w:r>
+              <w:rPr>
+                <w:noProof/>
+                <w:webHidden/>
+              </w:rPr>
+              <w:instrText xml:space="preserve"> PAGEREF _Toc225619445 \h </w:instrText>
+            </w:r>
+            <w:r>
+              <w:rPr>
+                <w:noProof/>
+                <w:webHidden/>
+              </w:rPr>
+            </w:r>
+            <w:r>
+              <w:rPr>
+                <w:noProof/>
+                <w:webHidden/>
+              </w:rPr>
+              <w:fldChar w:fldCharType="separate"/>
+            </w:r>
+            <w:r>
+              <w:rPr>
+                <w:noProof/>
+                <w:webHidden/>
+              </w:rPr>
+              <w:t>14</w:t>
+            </w:r>
+            <w:r>
+              <w:rPr>
+                <w:noProof/>
+                <w:webHidden/>
+              </w:rPr>
+              <w:fldChar w:fldCharType="end"/>
+            </w:r>
+          </w:hyperlink>
+        </w:p>
+        <w:p>
+          <w:pPr>
+            <w:pStyle w:val="TOC2"/>
+            <w:tabs>
+              <w:tab w:val="left" w:pos="720"/>
+              <w:tab w:val="right" w:leader="dot" w:pos="9350"/>
+            </w:tabs>
+            <w:rPr>
+              <w:noProof/>
+            </w:rPr>
+          </w:pPr>
+          <w:hyperlink w:anchor="_Toc225619446" w:history="1">
+            <w:r>
+              <w:rPr>
+                <w:rStyle w:val="Hyperlink"/>
+                <w:noProof/>
+              </w:rPr>
+              <w:t>1.</w:t>
+            </w:r>
+            <w:r>
+              <w:rPr>
+                <w:noProof/>
+              </w:rPr>
+              <w:tab/>
+            </w:r>
+            <w:r>
+              <w:rPr>
+                <w:rStyle w:val="Hyperlink"/>
+                <w:noProof/>
+              </w:rPr>
+              <w:t>Bài 1: Tạo Dockerfile chạy một ứng dụng Node.js đơn giản</w:t>
+            </w:r>
+            <w:r>
+              <w:rPr>
+                <w:noProof/>
+                <w:webHidden/>
+              </w:rPr>
+              <w:tab/>
+            </w:r>
+            <w:r>
+              <w:rPr>
+                <w:noProof/>
+                <w:webHidden/>
+              </w:rPr>
+              <w:fldChar w:fldCharType="begin"/>
+            </w:r>
+            <w:r>
+              <w:rPr>
+                <w:noProof/>
+                <w:webHidden/>
+              </w:rPr>
+              <w:instrText xml:space="preserve"> PAGEREF _Toc225619446 \h </w:instrText>
+            </w:r>
+            <w:r>
+              <w:rPr>
+                <w:noProof/>
+                <w:webHidden/>
+              </w:rPr>
+            </w:r>
+            <w:r>
+              <w:rPr>
+                <w:noProof/>
+                <w:webHidden/>
+              </w:rPr>
+              <w:fldChar w:fldCharType="separate"/>
+            </w:r>
+            <w:r>
+              <w:rPr>
+                <w:noProof/>
+                <w:webHidden/>
+              </w:rPr>
+              <w:t>14</w:t>
+            </w:r>
+            <w:r>
+              <w:rPr>
+                <w:noProof/>
+                <w:webHidden/>
+              </w:rPr>
+              <w:fldChar w:fldCharType="end"/>
+            </w:r>
+          </w:hyperlink>
+        </w:p>
+        <w:p>
+          <w:pPr>
+            <w:pStyle w:val="TOC2"/>
+            <w:tabs>
+              <w:tab w:val="left" w:pos="720"/>
+              <w:tab w:val="right" w:leader="dot" w:pos="9350"/>
+            </w:tabs>
+            <w:rPr>
+              <w:noProof/>
+            </w:rPr>
+          </w:pPr>
+          <w:hyperlink w:anchor="_Toc225619447" w:history="1">
+            <w:r>
+              <w:rPr>
+                <w:rStyle w:val="Hyperlink"/>
+                <w:noProof/>
+              </w:rPr>
+              <w:t>2.</w:t>
+            </w:r>
+            <w:r>
+              <w:rPr>
+                <w:noProof/>
+              </w:rPr>
+              <w:tab/>
+            </w:r>
+            <w:r>
+              <w:rPr>
+                <w:rStyle w:val="Hyperlink"/>
+                <w:noProof/>
+              </w:rPr>
+              <w:t>Bài 2: Tạo Dockerfile chạy một ứng dụng Python Flask</w:t>
+            </w:r>
+            <w:r>
+              <w:rPr>
+                <w:noProof/>
+                <w:webHidden/>
+              </w:rPr>
+              <w:tab/>
+            </w:r>
+            <w:r>
+              <w:rPr>
+                <w:noProof/>
+                <w:webHidden/>
+              </w:rPr>
+              <w:fldChar w:fldCharType="begin"/>
+            </w:r>
+            <w:r>
+              <w:rPr>
+                <w:noProof/>
+                <w:webHidden/>
+              </w:rPr>
+              <w:instrText xml:space="preserve"> PAGEREF _Toc225619447 \h </w:instrText>
+            </w:r>
+            <w:r>
+              <w:rPr>
+                <w:noProof/>
+                <w:webHidden/>
+              </w:rPr>
+            </w:r>
+            <w:r>
+              <w:rPr>
+                <w:noProof/>
+                <w:webHidden/>
+              </w:rPr>
+              <w:fldChar w:fldCharType="separate"/>
+            </w:r>
+            <w:r>
+              <w:rPr>
+                <w:noProof/>
+                <w:webHidden/>
+              </w:rPr>
+              <w:t>14</w:t>
+            </w:r>
+            <w:r>
+              <w:rPr>
+                <w:noProof/>
+                <w:webHidden/>
+              </w:rPr>
+              <w:fldChar w:fldCharType="end"/>
+            </w:r>
+          </w:hyperlink>
+        </w:p>
+        <w:p>
+          <w:r>
+            <w:rPr>
+              <w:b/>
+              <w:bCs/>
+              <w:noProof/>
+            </w:rPr>
+            <w:fldChar w:fldCharType="end"/>
+          </w:r>
+        </w:p>
+      </w:sdtContent>
+    </w:sdt>
+    <w:p/>
     <w:p/>
     <w:p>
       <w:pPr>
         <w:pStyle w:val="Heading1"/>
       </w:pPr>
+      <w:bookmarkStart w:id="0" w:name="_Toc225619413"/>
       <w:r>
         <w:t>Các lệnh cơ bản thao tác với Docker</w:t>
       </w:r>
+      <w:bookmarkEnd w:id="0"/>
     </w:p>
     <w:p>
       <w:pPr>
         <w:pStyle w:val="Heading2"/>
       </w:pPr>
+      <w:bookmarkStart w:id="1" w:name="_Toc225619414"/>
       <w:r>
         <w:t xml:space="preserve">docker </w:t>
       </w:r>
@@ -34,9 +2983,13 @@
       <w:r>
         <w:t>version</w:t>
       </w:r>
-    </w:p>
-    <w:p>
-      <w:r>
+      <w:bookmarkEnd w:id="1"/>
+    </w:p>
+    <w:p>
+      <w:r>
+        <w:rPr>
+          <w:noProof/>
+        </w:rPr>
         <w:drawing>
           <wp:inline distT="0" distB="0" distL="0" distR="0" wp14:anchorId="1AAAF9FD" wp14:editId="6A82C516">
             <wp:extent cx="5943600" cy="1675130"/>
@@ -53,7 +3006,7 @@
                     <pic:cNvPicPr/>
                   </pic:nvPicPr>
                   <pic:blipFill>
-                    <a:blip r:embed="rId5"/>
+                    <a:blip r:embed="rId6"/>
                     <a:stretch>
                       <a:fillRect/>
                     </a:stretch>
@@ -78,12 +3031,18 @@
       <w:pPr>
         <w:pStyle w:val="Heading2"/>
       </w:pPr>
-      <w:r>
+      <w:bookmarkStart w:id="2" w:name="_Toc225619415"/>
+      <w:r>
+        <w:lastRenderedPageBreak/>
         <w:t>docker run hello-world</w:t>
       </w:r>
-    </w:p>
-    <w:p>
-      <w:r>
+      <w:bookmarkEnd w:id="2"/>
+    </w:p>
+    <w:p>
+      <w:r>
+        <w:rPr>
+          <w:noProof/>
+        </w:rPr>
         <w:drawing>
           <wp:inline distT="0" distB="0" distL="0" distR="0" wp14:anchorId="2E4C742A" wp14:editId="4A260A1F">
             <wp:extent cx="5943600" cy="4142740"/>
@@ -100,7 +3059,7 @@
                     <pic:cNvPicPr/>
                   </pic:nvPicPr>
                   <pic:blipFill>
-                    <a:blip r:embed="rId6"/>
+                    <a:blip r:embed="rId7"/>
                     <a:stretch>
                       <a:fillRect/>
                     </a:stretch>
@@ -125,13 +3084,17 @@
       <w:pPr>
         <w:pStyle w:val="Heading2"/>
       </w:pPr>
-      <w:r>
-        <w:lastRenderedPageBreak/>
+      <w:bookmarkStart w:id="3" w:name="_Toc225619416"/>
+      <w:r>
         <w:t>docker pull nginx</w:t>
       </w:r>
-    </w:p>
-    <w:p>
-      <w:r>
+      <w:bookmarkEnd w:id="3"/>
+    </w:p>
+    <w:p>
+      <w:r>
+        <w:rPr>
+          <w:noProof/>
+        </w:rPr>
         <w:drawing>
           <wp:inline distT="0" distB="0" distL="0" distR="0" wp14:anchorId="61053649" wp14:editId="019145BD">
             <wp:extent cx="5943600" cy="2513330"/>
@@ -148,7 +3111,7 @@
                     <pic:cNvPicPr/>
                   </pic:nvPicPr>
                   <pic:blipFill>
-                    <a:blip r:embed="rId7"/>
+                    <a:blip r:embed="rId8"/>
                     <a:stretch>
                       <a:fillRect/>
                     </a:stretch>
@@ -173,12 +3136,18 @@
       <w:pPr>
         <w:pStyle w:val="Heading2"/>
       </w:pPr>
-      <w:r>
+      <w:bookmarkStart w:id="4" w:name="_Toc225619417"/>
+      <w:r>
+        <w:lastRenderedPageBreak/>
         <w:t>docker images</w:t>
       </w:r>
-    </w:p>
-    <w:p>
-      <w:r>
+      <w:bookmarkEnd w:id="4"/>
+    </w:p>
+    <w:p>
+      <w:r>
+        <w:rPr>
+          <w:noProof/>
+        </w:rPr>
         <w:drawing>
           <wp:inline distT="0" distB="0" distL="0" distR="0" wp14:anchorId="0493DD38" wp14:editId="2E3D9755">
             <wp:extent cx="5943600" cy="3185160"/>
@@ -195,7 +3164,7 @@
                     <pic:cNvPicPr/>
                   </pic:nvPicPr>
                   <pic:blipFill>
-                    <a:blip r:embed="rId8"/>
+                    <a:blip r:embed="rId9"/>
                     <a:stretch>
                       <a:fillRect/>
                     </a:stretch>
@@ -220,12 +3189,17 @@
       <w:pPr>
         <w:pStyle w:val="Heading2"/>
       </w:pPr>
+      <w:bookmarkStart w:id="5" w:name="_Toc225619418"/>
       <w:r>
         <w:t>docker run -d nginx</w:t>
       </w:r>
-    </w:p>
-    <w:p>
-      <w:r>
+      <w:bookmarkEnd w:id="5"/>
+    </w:p>
+    <w:p>
+      <w:r>
+        <w:rPr>
+          <w:noProof/>
+        </w:rPr>
         <w:drawing>
           <wp:inline distT="0" distB="0" distL="0" distR="0" wp14:anchorId="482ABF1B" wp14:editId="326E1AF3">
             <wp:extent cx="5943600" cy="1176655"/>
@@ -242,7 +3216,7 @@
                     <pic:cNvPicPr/>
                   </pic:nvPicPr>
                   <pic:blipFill>
-                    <a:blip r:embed="rId9"/>
+                    <a:blip r:embed="rId10"/>
                     <a:stretch>
                       <a:fillRect/>
                     </a:stretch>
@@ -268,12 +3242,17 @@
       <w:pPr>
         <w:pStyle w:val="Heading2"/>
       </w:pPr>
+      <w:bookmarkStart w:id="6" w:name="_Toc225619419"/>
       <w:r>
         <w:t>docker ps</w:t>
       </w:r>
-    </w:p>
-    <w:p>
-      <w:r>
+      <w:bookmarkEnd w:id="6"/>
+    </w:p>
+    <w:p>
+      <w:r>
+        <w:rPr>
+          <w:noProof/>
+        </w:rPr>
         <w:drawing>
           <wp:inline distT="0" distB="0" distL="0" distR="0" wp14:anchorId="672E8440" wp14:editId="50FBAEE0">
             <wp:extent cx="5943600" cy="1343025"/>
@@ -290,7 +3269,7 @@
                     <pic:cNvPicPr/>
                   </pic:nvPicPr>
                   <pic:blipFill>
-                    <a:blip r:embed="rId10"/>
+                    <a:blip r:embed="rId11"/>
                     <a:stretch>
                       <a:fillRect/>
                     </a:stretch>
@@ -315,12 +3294,18 @@
       <w:pPr>
         <w:pStyle w:val="Heading2"/>
       </w:pPr>
-      <w:r>
+      <w:bookmarkStart w:id="7" w:name="_Toc225619420"/>
+      <w:r>
+        <w:lastRenderedPageBreak/>
         <w:t>docker ps -a</w:t>
       </w:r>
-    </w:p>
-    <w:p>
-      <w:r>
+      <w:bookmarkEnd w:id="7"/>
+    </w:p>
+    <w:p>
+      <w:r>
+        <w:rPr>
+          <w:noProof/>
+        </w:rPr>
         <w:drawing>
           <wp:inline distT="0" distB="0" distL="0" distR="0" wp14:anchorId="05306328" wp14:editId="35AF8C40">
             <wp:extent cx="5943600" cy="2021840"/>
@@ -337,7 +3322,7 @@
                     <pic:cNvPicPr/>
                   </pic:nvPicPr>
                   <pic:blipFill>
-                    <a:blip r:embed="rId11"/>
+                    <a:blip r:embed="rId12"/>
                     <a:stretch>
                       <a:fillRect/>
                     </a:stretch>
@@ -362,13 +3347,17 @@
       <w:pPr>
         <w:pStyle w:val="Heading2"/>
       </w:pPr>
-      <w:r>
-        <w:lastRenderedPageBreak/>
+      <w:bookmarkStart w:id="8" w:name="_Toc225619421"/>
+      <w:r>
         <w:t>docker logs &lt;container_id&gt;</w:t>
       </w:r>
-    </w:p>
-    <w:p>
-      <w:r>
+      <w:bookmarkEnd w:id="8"/>
+    </w:p>
+    <w:p>
+      <w:r>
+        <w:rPr>
+          <w:noProof/>
+        </w:rPr>
         <w:drawing>
           <wp:inline distT="0" distB="0" distL="0" distR="0" wp14:anchorId="2FF60F87" wp14:editId="48317102">
             <wp:extent cx="5943600" cy="3739515"/>
@@ -385,7 +3374,7 @@
                     <pic:cNvPicPr/>
                   </pic:nvPicPr>
                   <pic:blipFill>
-                    <a:blip r:embed="rId12"/>
+                    <a:blip r:embed="rId13"/>
                     <a:stretch>
                       <a:fillRect/>
                     </a:stretch>
@@ -410,12 +3399,18 @@
       <w:pPr>
         <w:pStyle w:val="Heading2"/>
       </w:pPr>
-      <w:r>
+      <w:bookmarkStart w:id="9" w:name="_Toc225619422"/>
+      <w:r>
+        <w:lastRenderedPageBreak/>
         <w:t>docker exec -it &lt;container_id&gt; /bin/sh</w:t>
       </w:r>
-    </w:p>
-    <w:p>
-      <w:r>
+      <w:bookmarkEnd w:id="9"/>
+    </w:p>
+    <w:p>
+      <w:r>
+        <w:rPr>
+          <w:noProof/>
+        </w:rPr>
         <w:drawing>
           <wp:inline distT="0" distB="0" distL="0" distR="0" wp14:anchorId="04908327" wp14:editId="5AB2A84E">
             <wp:extent cx="5943600" cy="2012950"/>
@@ -432,7 +3427,7 @@
                     <pic:cNvPicPr/>
                   </pic:nvPicPr>
                   <pic:blipFill>
-                    <a:blip r:embed="rId13"/>
+                    <a:blip r:embed="rId14"/>
                     <a:stretch>
                       <a:fillRect/>
                     </a:stretch>
@@ -458,13 +3453,17 @@
       <w:pPr>
         <w:pStyle w:val="Heading2"/>
       </w:pPr>
-      <w:r>
-        <w:lastRenderedPageBreak/>
+      <w:bookmarkStart w:id="10" w:name="_Toc225619423"/>
+      <w:r>
         <w:t>docker stop &lt;container_id&gt;</w:t>
       </w:r>
-    </w:p>
-    <w:p>
-      <w:r>
+      <w:bookmarkEnd w:id="10"/>
+    </w:p>
+    <w:p>
+      <w:r>
+        <w:rPr>
+          <w:noProof/>
+        </w:rPr>
         <w:drawing>
           <wp:inline distT="0" distB="0" distL="0" distR="0" wp14:anchorId="640DAE2C" wp14:editId="11D84FCB">
             <wp:extent cx="5943600" cy="3467735"/>
@@ -481,7 +3480,7 @@
                     <pic:cNvPicPr/>
                   </pic:nvPicPr>
                   <pic:blipFill>
-                    <a:blip r:embed="rId14"/>
+                    <a:blip r:embed="rId15"/>
                     <a:stretch>
                       <a:fillRect/>
                     </a:stretch>
@@ -506,12 +3505,18 @@
       <w:pPr>
         <w:pStyle w:val="Heading2"/>
       </w:pPr>
-      <w:r>
+      <w:bookmarkStart w:id="11" w:name="_Toc225619424"/>
+      <w:r>
+        <w:lastRenderedPageBreak/>
         <w:t>docker restart &lt;container_id&gt;</w:t>
       </w:r>
-    </w:p>
-    <w:p>
-      <w:r>
+      <w:bookmarkEnd w:id="11"/>
+    </w:p>
+    <w:p>
+      <w:r>
+        <w:rPr>
+          <w:noProof/>
+        </w:rPr>
         <w:drawing>
           <wp:inline distT="0" distB="0" distL="0" distR="0" wp14:anchorId="3976603B" wp14:editId="0D567F38">
             <wp:extent cx="4648849" cy="1476581"/>
@@ -528,7 +3533,7 @@
                     <pic:cNvPicPr/>
                   </pic:nvPicPr>
                   <pic:blipFill>
-                    <a:blip r:embed="rId15"/>
+                    <a:blip r:embed="rId16"/>
                     <a:stretch>
                       <a:fillRect/>
                     </a:stretch>
@@ -553,13 +3558,17 @@
       <w:pPr>
         <w:pStyle w:val="Heading2"/>
       </w:pPr>
-      <w:r>
-        <w:lastRenderedPageBreak/>
+      <w:bookmarkStart w:id="12" w:name="_Toc225619425"/>
+      <w:r>
         <w:t>docker rm &lt;container_id&gt;</w:t>
       </w:r>
-    </w:p>
-    <w:p>
-      <w:r>
+      <w:bookmarkEnd w:id="12"/>
+    </w:p>
+    <w:p>
+      <w:r>
+        <w:rPr>
+          <w:noProof/>
+        </w:rPr>
         <w:drawing>
           <wp:inline distT="0" distB="0" distL="0" distR="0" wp14:anchorId="332E19EA" wp14:editId="0AA4F1C4">
             <wp:extent cx="5191850" cy="2486372"/>
@@ -576,7 +3585,7 @@
                     <pic:cNvPicPr/>
                   </pic:nvPicPr>
                   <pic:blipFill>
-                    <a:blip r:embed="rId16"/>
+                    <a:blip r:embed="rId17"/>
                     <a:stretch>
                       <a:fillRect/>
                     </a:stretch>
@@ -601,12 +3610,17 @@
       <w:pPr>
         <w:pStyle w:val="Heading2"/>
       </w:pPr>
+      <w:bookmarkStart w:id="13" w:name="_Toc225619426"/>
       <w:r>
         <w:t>docker container prune</w:t>
       </w:r>
-    </w:p>
-    <w:p>
-      <w:r>
+      <w:bookmarkEnd w:id="13"/>
+    </w:p>
+    <w:p>
+      <w:r>
+        <w:rPr>
+          <w:noProof/>
+        </w:rPr>
         <w:drawing>
           <wp:inline distT="0" distB="0" distL="0" distR="0" wp14:anchorId="15C94004" wp14:editId="1F7D383F">
             <wp:extent cx="5943600" cy="2640965"/>
@@ -623,7 +3637,7 @@
                     <pic:cNvPicPr/>
                   </pic:nvPicPr>
                   <pic:blipFill>
-                    <a:blip r:embed="rId17"/>
+                    <a:blip r:embed="rId18"/>
                     <a:stretch>
                       <a:fillRect/>
                     </a:stretch>
@@ -648,12 +3662,18 @@
       <w:pPr>
         <w:pStyle w:val="Heading2"/>
       </w:pPr>
-      <w:r>
+      <w:bookmarkStart w:id="14" w:name="_Toc225619427"/>
+      <w:r>
+        <w:lastRenderedPageBreak/>
         <w:t>docker rmi &lt;image_id&gt;</w:t>
       </w:r>
-    </w:p>
-    <w:p>
-      <w:r>
+      <w:bookmarkEnd w:id="14"/>
+    </w:p>
+    <w:p>
+      <w:r>
+        <w:rPr>
+          <w:noProof/>
+        </w:rPr>
         <w:drawing>
           <wp:inline distT="0" distB="0" distL="0" distR="0" wp14:anchorId="61D28609" wp14:editId="58AF4ED6">
             <wp:extent cx="5943600" cy="1669415"/>
@@ -670,7 +3690,7 @@
                     <pic:cNvPicPr/>
                   </pic:nvPicPr>
                   <pic:blipFill>
-                    <a:blip r:embed="rId18"/>
+                    <a:blip r:embed="rId19"/>
                     <a:stretch>
                       <a:fillRect/>
                     </a:stretch>
@@ -695,13 +3715,17 @@
       <w:pPr>
         <w:pStyle w:val="Heading2"/>
       </w:pPr>
-      <w:r>
-        <w:lastRenderedPageBreak/>
+      <w:bookmarkStart w:id="15" w:name="_Toc225619428"/>
+      <w:r>
         <w:t>docker image prune -a</w:t>
       </w:r>
-    </w:p>
-    <w:p>
-      <w:r>
+      <w:bookmarkEnd w:id="15"/>
+    </w:p>
+    <w:p>
+      <w:r>
+        <w:rPr>
+          <w:noProof/>
+        </w:rPr>
         <w:drawing>
           <wp:inline distT="0" distB="0" distL="0" distR="0" wp14:anchorId="1EBB116D" wp14:editId="787E7EA1">
             <wp:extent cx="5943600" cy="3889375"/>
@@ -718,7 +3742,7 @@
                     <pic:cNvPicPr/>
                   </pic:nvPicPr>
                   <pic:blipFill>
-                    <a:blip r:embed="rId19"/>
+                    <a:blip r:embed="rId20"/>
                     <a:stretch>
                       <a:fillRect/>
                     </a:stretch>
@@ -743,12 +3767,18 @@
       <w:pPr>
         <w:pStyle w:val="Heading2"/>
       </w:pPr>
-      <w:r>
+      <w:bookmarkStart w:id="16" w:name="_Toc225619429"/>
+      <w:r>
+        <w:lastRenderedPageBreak/>
         <w:t>docker run -d -p 8080:80 nginx</w:t>
       </w:r>
-    </w:p>
-    <w:p>
-      <w:r>
+      <w:bookmarkEnd w:id="16"/>
+    </w:p>
+    <w:p>
+      <w:r>
+        <w:rPr>
+          <w:noProof/>
+        </w:rPr>
         <w:drawing>
           <wp:inline distT="0" distB="0" distL="0" distR="0" wp14:anchorId="01005A28" wp14:editId="02735276">
             <wp:extent cx="5943600" cy="2834640"/>
@@ -765,7 +3795,7 @@
                     <pic:cNvPicPr/>
                   </pic:nvPicPr>
                   <pic:blipFill>
-                    <a:blip r:embed="rId20"/>
+                    <a:blip r:embed="rId21"/>
                     <a:stretch>
                       <a:fillRect/>
                     </a:stretch>
@@ -790,13 +3820,18 @@
       <w:pPr>
         <w:pStyle w:val="Heading2"/>
       </w:pPr>
+      <w:bookmarkStart w:id="17" w:name="_Toc225619430"/>
       <w:r>
         <w:lastRenderedPageBreak/>
         <w:t>docker inspect &lt;container_id&gt;</w:t>
       </w:r>
-    </w:p>
-    <w:p>
-      <w:r>
+      <w:bookmarkEnd w:id="17"/>
+    </w:p>
+    <w:p>
+      <w:r>
+        <w:rPr>
+          <w:noProof/>
+        </w:rPr>
         <w:drawing>
           <wp:inline distT="0" distB="0" distL="0" distR="0" wp14:anchorId="6F93649D" wp14:editId="437B723F">
             <wp:extent cx="5943600" cy="6384925"/>
@@ -813,7 +3848,7 @@
                     <pic:cNvPicPr/>
                   </pic:nvPicPr>
                   <pic:blipFill>
-                    <a:blip r:embed="rId21"/>
+                    <a:blip r:embed="rId22"/>
                     <a:stretch>
                       <a:fillRect/>
                     </a:stretch>
@@ -838,13 +3873,18 @@
       <w:pPr>
         <w:pStyle w:val="Heading2"/>
       </w:pPr>
+      <w:bookmarkStart w:id="18" w:name="_Toc225619431"/>
       <w:r>
         <w:lastRenderedPageBreak/>
         <w:t>docker run -d -v mydata:/data nginx</w:t>
       </w:r>
-    </w:p>
-    <w:p>
-      <w:r>
+      <w:bookmarkEnd w:id="18"/>
+    </w:p>
+    <w:p>
+      <w:r>
+        <w:rPr>
+          <w:noProof/>
+        </w:rPr>
         <w:drawing>
           <wp:inline distT="0" distB="0" distL="0" distR="0" wp14:anchorId="61297940" wp14:editId="104A68B0">
             <wp:extent cx="5943600" cy="1186180"/>
@@ -861,7 +3901,7 @@
                     <pic:cNvPicPr/>
                   </pic:nvPicPr>
                   <pic:blipFill>
-                    <a:blip r:embed="rId22"/>
+                    <a:blip r:embed="rId23"/>
                     <a:stretch>
                       <a:fillRect/>
                     </a:stretch>
@@ -886,12 +3926,17 @@
       <w:pPr>
         <w:pStyle w:val="Heading2"/>
       </w:pPr>
+      <w:bookmarkStart w:id="19" w:name="_Toc225619432"/>
       <w:r>
         <w:t>docker volume ls</w:t>
       </w:r>
-    </w:p>
-    <w:p>
-      <w:r>
+      <w:bookmarkEnd w:id="19"/>
+    </w:p>
+    <w:p>
+      <w:r>
+        <w:rPr>
+          <w:noProof/>
+        </w:rPr>
         <w:drawing>
           <wp:inline distT="0" distB="0" distL="0" distR="0" wp14:anchorId="201ED1D0" wp14:editId="65F4CF0F">
             <wp:extent cx="5943600" cy="3303270"/>
@@ -908,7 +3953,7 @@
                     <pic:cNvPicPr/>
                   </pic:nvPicPr>
                   <pic:blipFill>
-                    <a:blip r:embed="rId23"/>
+                    <a:blip r:embed="rId24"/>
                     <a:stretch>
                       <a:fillRect/>
                     </a:stretch>
@@ -933,12 +3978,17 @@
       <w:pPr>
         <w:pStyle w:val="Heading2"/>
       </w:pPr>
+      <w:bookmarkStart w:id="20" w:name="_Toc225619433"/>
       <w:r>
         <w:t>docker volume prune</w:t>
       </w:r>
-    </w:p>
-    <w:p>
-      <w:r>
+      <w:bookmarkEnd w:id="20"/>
+    </w:p>
+    <w:p>
+      <w:r>
+        <w:rPr>
+          <w:noProof/>
+        </w:rPr>
         <w:drawing>
           <wp:inline distT="0" distB="0" distL="0" distR="0" wp14:anchorId="0551AAA3" wp14:editId="1D197B4B">
             <wp:extent cx="5943600" cy="2016125"/>
@@ -955,7 +4005,7 @@
                     <pic:cNvPicPr/>
                   </pic:nvPicPr>
                   <pic:blipFill>
-                    <a:blip r:embed="rId24"/>
+                    <a:blip r:embed="rId25"/>
                     <a:stretch>
                       <a:fillRect/>
                     </a:stretch>
@@ -980,13 +4030,18 @@
       <w:pPr>
         <w:pStyle w:val="Heading2"/>
       </w:pPr>
+      <w:bookmarkStart w:id="21" w:name="_Toc225619434"/>
       <w:r>
         <w:lastRenderedPageBreak/>
         <w:t>docker run -d --name my_nginx nginx</w:t>
       </w:r>
-    </w:p>
-    <w:p>
-      <w:r>
+      <w:bookmarkEnd w:id="21"/>
+    </w:p>
+    <w:p>
+      <w:r>
+        <w:rPr>
+          <w:noProof/>
+        </w:rPr>
         <w:drawing>
           <wp:inline distT="0" distB="0" distL="0" distR="0" wp14:anchorId="48645E2C" wp14:editId="641ECE36">
             <wp:extent cx="5943600" cy="688340"/>
@@ -1003,7 +4058,7 @@
                     <pic:cNvPicPr/>
                   </pic:nvPicPr>
                   <pic:blipFill>
-                    <a:blip r:embed="rId25"/>
+                    <a:blip r:embed="rId26"/>
                     <a:stretch>
                       <a:fillRect/>
                     </a:stretch>
@@ -1028,12 +4083,17 @@
       <w:pPr>
         <w:pStyle w:val="Heading2"/>
       </w:pPr>
+      <w:bookmarkStart w:id="22" w:name="_Toc225619435"/>
       <w:r>
         <w:t>docker stats</w:t>
       </w:r>
-    </w:p>
-    <w:p>
-      <w:r>
+      <w:bookmarkEnd w:id="22"/>
+    </w:p>
+    <w:p>
+      <w:r>
+        <w:rPr>
+          <w:noProof/>
+        </w:rPr>
         <w:drawing>
           <wp:inline distT="0" distB="0" distL="0" distR="0" wp14:anchorId="6EE65754" wp14:editId="6BF59E59">
             <wp:extent cx="5943600" cy="2896870"/>
@@ -1050,7 +4110,7 @@
                     <pic:cNvPicPr/>
                   </pic:nvPicPr>
                   <pic:blipFill>
-                    <a:blip r:embed="rId26"/>
+                    <a:blip r:embed="rId27"/>
                     <a:stretch>
                       <a:fillRect/>
                     </a:stretch>
@@ -1075,12 +4135,17 @@
       <w:pPr>
         <w:pStyle w:val="Heading2"/>
       </w:pPr>
+      <w:bookmarkStart w:id="23" w:name="_Toc225619436"/>
       <w:r>
         <w:t>docker network ls</w:t>
       </w:r>
-    </w:p>
-    <w:p>
-      <w:r>
+      <w:bookmarkEnd w:id="23"/>
+    </w:p>
+    <w:p>
+      <w:r>
+        <w:rPr>
+          <w:noProof/>
+        </w:rPr>
         <w:drawing>
           <wp:inline distT="0" distB="0" distL="0" distR="0" wp14:anchorId="5AB32FA3" wp14:editId="01053290">
             <wp:extent cx="5943600" cy="1765300"/>
@@ -1097,7 +4162,7 @@
                     <pic:cNvPicPr/>
                   </pic:nvPicPr>
                   <pic:blipFill>
-                    <a:blip r:embed="rId27"/>
+                    <a:blip r:embed="rId28"/>
                     <a:stretch>
                       <a:fillRect/>
                     </a:stretch>
@@ -1122,12 +4187,17 @@
       <w:pPr>
         <w:pStyle w:val="Heading2"/>
       </w:pPr>
+      <w:bookmarkStart w:id="24" w:name="_Toc225619437"/>
       <w:r>
         <w:t>docker network create my_network</w:t>
       </w:r>
-    </w:p>
-    <w:p>
-      <w:r>
+      <w:bookmarkEnd w:id="24"/>
+    </w:p>
+    <w:p>
+      <w:r>
+        <w:rPr>
+          <w:noProof/>
+        </w:rPr>
         <w:drawing>
           <wp:inline distT="0" distB="0" distL="0" distR="0" wp14:anchorId="27FE7628" wp14:editId="02AA0414">
             <wp:extent cx="5943600" cy="749300"/>
@@ -1144,7 +4214,7 @@
                     <pic:cNvPicPr/>
                   </pic:nvPicPr>
                   <pic:blipFill>
-                    <a:blip r:embed="rId28"/>
+                    <a:blip r:embed="rId29"/>
                     <a:stretch>
                       <a:fillRect/>
                     </a:stretch>
@@ -1169,13 +4239,18 @@
       <w:pPr>
         <w:pStyle w:val="Heading2"/>
       </w:pPr>
+      <w:bookmarkStart w:id="25" w:name="_Toc225619438"/>
       <w:r>
         <w:lastRenderedPageBreak/>
         <w:t>docker run -d --network my_network --name my_container nginx</w:t>
       </w:r>
-    </w:p>
-    <w:p>
-      <w:r>
+      <w:bookmarkEnd w:id="25"/>
+    </w:p>
+    <w:p>
+      <w:r>
+        <w:rPr>
+          <w:noProof/>
+        </w:rPr>
         <w:drawing>
           <wp:inline distT="0" distB="0" distL="0" distR="0" wp14:anchorId="23287672" wp14:editId="7D513EC5">
             <wp:extent cx="5943600" cy="1007745"/>
@@ -1192,7 +4267,7 @@
                     <pic:cNvPicPr/>
                   </pic:nvPicPr>
                   <pic:blipFill>
-                    <a:blip r:embed="rId29"/>
+                    <a:blip r:embed="rId30"/>
                     <a:stretch>
                       <a:fillRect/>
                     </a:stretch>
@@ -1217,12 +4292,17 @@
       <w:pPr>
         <w:pStyle w:val="Heading2"/>
       </w:pPr>
+      <w:bookmarkStart w:id="26" w:name="_Toc225619439"/>
       <w:r>
         <w:t>docker network connect my_network my_nginx</w:t>
       </w:r>
-    </w:p>
-    <w:p>
-      <w:r>
+      <w:bookmarkEnd w:id="26"/>
+    </w:p>
+    <w:p>
+      <w:r>
+        <w:rPr>
+          <w:noProof/>
+        </w:rPr>
         <w:drawing>
           <wp:inline distT="0" distB="0" distL="0" distR="0" wp14:anchorId="7392D12C" wp14:editId="1F2EBA22">
             <wp:extent cx="5943600" cy="920115"/>
@@ -1239,7 +4319,7 @@
                     <pic:cNvPicPr/>
                   </pic:nvPicPr>
                   <pic:blipFill>
-                    <a:blip r:embed="rId30"/>
+                    <a:blip r:embed="rId31"/>
                     <a:stretch>
                       <a:fillRect/>
                     </a:stretch>
@@ -1264,12 +4344,17 @@
       <w:pPr>
         <w:pStyle w:val="Heading2"/>
       </w:pPr>
+      <w:bookmarkStart w:id="27" w:name="_Toc225619440"/>
       <w:r>
         <w:t>docker run -d -e MY_ENV=hello_world nginx</w:t>
       </w:r>
-    </w:p>
-    <w:p>
-      <w:r>
+      <w:bookmarkEnd w:id="27"/>
+    </w:p>
+    <w:p>
+      <w:r>
+        <w:rPr>
+          <w:noProof/>
+        </w:rPr>
         <w:drawing>
           <wp:inline distT="0" distB="0" distL="0" distR="0" wp14:anchorId="365F3FB3" wp14:editId="248408A3">
             <wp:extent cx="5943600" cy="824865"/>
@@ -1286,7 +4371,7 @@
                     <pic:cNvPicPr/>
                   </pic:nvPicPr>
                   <pic:blipFill>
-                    <a:blip r:embed="rId31"/>
+                    <a:blip r:embed="rId32"/>
                     <a:stretch>
                       <a:fillRect/>
                     </a:stretch>
@@ -1311,13 +4396,18 @@
       <w:pPr>
         <w:pStyle w:val="Heading2"/>
       </w:pPr>
+      <w:bookmarkStart w:id="28" w:name="_Toc225619441"/>
       <w:r>
         <w:lastRenderedPageBreak/>
         <w:t>docker logs -f my_nginx</w:t>
       </w:r>
-    </w:p>
-    <w:p>
-      <w:r>
+      <w:bookmarkEnd w:id="28"/>
+    </w:p>
+    <w:p>
+      <w:r>
+        <w:rPr>
+          <w:noProof/>
+        </w:rPr>
         <w:drawing>
           <wp:inline distT="0" distB="0" distL="0" distR="0" wp14:anchorId="7ED90B50" wp14:editId="7ECA0B92">
             <wp:extent cx="5943600" cy="5210175"/>
@@ -1334,7 +4424,7 @@
                     <pic:cNvPicPr/>
                   </pic:nvPicPr>
                   <pic:blipFill>
-                    <a:blip r:embed="rId32"/>
+                    <a:blip r:embed="rId33"/>
                     <a:stretch>
                       <a:fillRect/>
                     </a:stretch>
@@ -1359,6 +4449,7 @@
       <w:pPr>
         <w:pStyle w:val="Heading2"/>
       </w:pPr>
+      <w:bookmarkStart w:id="29" w:name="_Toc225619442"/>
       <w:r>
         <w:t>FROM nginx</w:t>
       </w:r>
@@ -1368,19 +4459,25 @@
       <w:r>
         <w:t>COPY index.html /usr/share/nginx/html/index.html</w:t>
       </w:r>
+      <w:bookmarkEnd w:id="29"/>
     </w:p>
     <w:p/>
     <w:p>
       <w:pPr>
         <w:pStyle w:val="Heading2"/>
       </w:pPr>
+      <w:bookmarkStart w:id="30" w:name="_Toc225619443"/>
       <w:r>
         <w:lastRenderedPageBreak/>
         <w:t>docker build -t my_nginx_image .</w:t>
       </w:r>
-    </w:p>
-    <w:p>
-      <w:r>
+      <w:bookmarkEnd w:id="30"/>
+    </w:p>
+    <w:p>
+      <w:r>
+        <w:rPr>
+          <w:noProof/>
+        </w:rPr>
         <w:drawing>
           <wp:inline distT="0" distB="0" distL="0" distR="0" wp14:anchorId="3FD290C6" wp14:editId="6308C2D8">
             <wp:extent cx="5943600" cy="3472815"/>
@@ -1397,7 +4494,7 @@
                     <pic:cNvPicPr/>
                   </pic:nvPicPr>
                   <pic:blipFill>
-                    <a:blip r:embed="rId33"/>
+                    <a:blip r:embed="rId34"/>
                     <a:stretch>
                       <a:fillRect/>
                     </a:stretch>
@@ -1422,12 +4519,17 @@
       <w:pPr>
         <w:pStyle w:val="Heading2"/>
       </w:pPr>
+      <w:bookmarkStart w:id="31" w:name="_Toc225619444"/>
       <w:r>
         <w:t>docker run -d -p 8080:80 my_nginx_image</w:t>
       </w:r>
-    </w:p>
-    <w:p>
-      <w:r>
+      <w:bookmarkEnd w:id="31"/>
+    </w:p>
+    <w:p>
+      <w:r>
+        <w:rPr>
+          <w:noProof/>
+        </w:rPr>
         <w:drawing>
           <wp:inline distT="0" distB="0" distL="0" distR="0" wp14:anchorId="27764232" wp14:editId="1B526C2C">
             <wp:extent cx="5943600" cy="2960370"/>
@@ -1444,7 +4546,7 @@
                     <pic:cNvPicPr/>
                   </pic:nvPicPr>
                   <pic:blipFill>
-                    <a:blip r:embed="rId34"/>
+                    <a:blip r:embed="rId35"/>
                     <a:stretch>
                       <a:fillRect/>
                     </a:stretch>
@@ -1465,6 +4567,230 @@
         </w:drawing>
       </w:r>
     </w:p>
+    <w:p/>
+    <w:p>
+      <w:pPr>
+        <w:pStyle w:val="Heading1"/>
+      </w:pPr>
+      <w:bookmarkStart w:id="32" w:name="_Toc225619445"/>
+      <w:r>
+        <w:lastRenderedPageBreak/>
+        <w:t>Thao tác với Dockerfile</w:t>
+      </w:r>
+      <w:bookmarkEnd w:id="32"/>
+    </w:p>
+    <w:p>
+      <w:pPr>
+        <w:pStyle w:val="Heading2"/>
+        <w:numPr>
+          <w:ilvl w:val="0"/>
+          <w:numId w:val="3"/>
+        </w:numPr>
+      </w:pPr>
+      <w:bookmarkStart w:id="33" w:name="_Toc225619446"/>
+      <w:r>
+        <w:t>Bài 1: Tạo Dockerfile chạy một ứng dụng Node.js đơn giản</w:t>
+      </w:r>
+      <w:bookmarkEnd w:id="33"/>
+    </w:p>
+    <w:p>
+      <w:r>
+        <w:drawing>
+          <wp:inline distT="0" distB="0" distL="0" distR="0" wp14:anchorId="10EEA171" wp14:editId="2A361D65">
+            <wp:extent cx="5943600" cy="3028315"/>
+            <wp:effectExtent l="0" t="0" r="0" b="635"/>
+            <wp:docPr id="708383420" name="Picture 1"/>
+            <wp:cNvGraphicFramePr>
+              <a:graphicFrameLocks xmlns:a="http://schemas.openxmlformats.org/drawingml/2006/main" noChangeAspect="1"/>
+            </wp:cNvGraphicFramePr>
+            <a:graphic xmlns:a="http://schemas.openxmlformats.org/drawingml/2006/main">
+              <a:graphicData uri="http://schemas.openxmlformats.org/drawingml/2006/picture">
+                <pic:pic xmlns:pic="http://schemas.openxmlformats.org/drawingml/2006/picture">
+                  <pic:nvPicPr>
+                    <pic:cNvPr id="708383420" name=""/>
+                    <pic:cNvPicPr/>
+                  </pic:nvPicPr>
+                  <pic:blipFill>
+                    <a:blip r:embed="rId36"/>
+                    <a:stretch>
+                      <a:fillRect/>
+                    </a:stretch>
+                  </pic:blipFill>
+                  <pic:spPr>
+                    <a:xfrm>
+                      <a:off x="0" y="0"/>
+                      <a:ext cx="5943600" cy="3028315"/>
+                    </a:xfrm>
+                    <a:prstGeom prst="rect">
+                      <a:avLst/>
+                    </a:prstGeom>
+                  </pic:spPr>
+                </pic:pic>
+              </a:graphicData>
+            </a:graphic>
+          </wp:inline>
+        </w:drawing>
+      </w:r>
+    </w:p>
+    <w:p/>
+    <w:p>
+      <w:pPr>
+        <w:pStyle w:val="Heading2"/>
+      </w:pPr>
+      <w:bookmarkStart w:id="34" w:name="_Toc225619447"/>
+      <w:r>
+        <w:lastRenderedPageBreak/>
+        <w:t>Bài 2: Tạo Dockerfile chạy một ứng dụng Python Flask</w:t>
+      </w:r>
+      <w:bookmarkEnd w:id="34"/>
+    </w:p>
+    <w:p>
+      <w:r>
+        <w:drawing>
+          <wp:inline distT="0" distB="0" distL="0" distR="0" wp14:anchorId="2D852FDC" wp14:editId="4B06FF8F">
+            <wp:extent cx="5943600" cy="3971925"/>
+            <wp:effectExtent l="0" t="0" r="0" b="9525"/>
+            <wp:docPr id="1321961531" name="Picture 1"/>
+            <wp:cNvGraphicFramePr>
+              <a:graphicFrameLocks xmlns:a="http://schemas.openxmlformats.org/drawingml/2006/main" noChangeAspect="1"/>
+            </wp:cNvGraphicFramePr>
+            <a:graphic xmlns:a="http://schemas.openxmlformats.org/drawingml/2006/main">
+              <a:graphicData uri="http://schemas.openxmlformats.org/drawingml/2006/picture">
+                <pic:pic xmlns:pic="http://schemas.openxmlformats.org/drawingml/2006/picture">
+                  <pic:nvPicPr>
+                    <pic:cNvPr id="1321961531" name=""/>
+                    <pic:cNvPicPr/>
+                  </pic:nvPicPr>
+                  <pic:blipFill>
+                    <a:blip r:embed="rId37"/>
+                    <a:stretch>
+                      <a:fillRect/>
+                    </a:stretch>
+                  </pic:blipFill>
+                  <pic:spPr>
+                    <a:xfrm>
+                      <a:off x="0" y="0"/>
+                      <a:ext cx="5943600" cy="3971925"/>
+                    </a:xfrm>
+                    <a:prstGeom prst="rect">
+                      <a:avLst/>
+                    </a:prstGeom>
+                  </pic:spPr>
+                </pic:pic>
+              </a:graphicData>
+            </a:graphic>
+          </wp:inline>
+        </w:drawing>
+      </w:r>
+    </w:p>
+    <w:p/>
+    <w:p>
+      <w:pPr>
+        <w:pStyle w:val="Heading2"/>
+      </w:pPr>
+      <w:r>
+        <w:lastRenderedPageBreak/>
+        <w:t>Bài 3: Tạo Dockerfile chạy một ứng dụng React</w:t>
+      </w:r>
+    </w:p>
+    <w:p>
+      <w:r>
+        <w:drawing>
+          <wp:inline distT="0" distB="0" distL="0" distR="0" wp14:anchorId="73B3CAFB" wp14:editId="5EC275D7">
+            <wp:extent cx="5943600" cy="4118610"/>
+            <wp:effectExtent l="0" t="0" r="0" b="0"/>
+            <wp:docPr id="1139211575" name="Picture 1"/>
+            <wp:cNvGraphicFramePr>
+              <a:graphicFrameLocks xmlns:a="http://schemas.openxmlformats.org/drawingml/2006/main" noChangeAspect="1"/>
+            </wp:cNvGraphicFramePr>
+            <a:graphic xmlns:a="http://schemas.openxmlformats.org/drawingml/2006/main">
+              <a:graphicData uri="http://schemas.openxmlformats.org/drawingml/2006/picture">
+                <pic:pic xmlns:pic="http://schemas.openxmlformats.org/drawingml/2006/picture">
+                  <pic:nvPicPr>
+                    <pic:cNvPr id="1139211575" name=""/>
+                    <pic:cNvPicPr/>
+                  </pic:nvPicPr>
+                  <pic:blipFill>
+                    <a:blip r:embed="rId38"/>
+                    <a:stretch>
+                      <a:fillRect/>
+                    </a:stretch>
+                  </pic:blipFill>
+                  <pic:spPr>
+                    <a:xfrm>
+                      <a:off x="0" y="0"/>
+                      <a:ext cx="5943600" cy="4118610"/>
+                    </a:xfrm>
+                    <a:prstGeom prst="rect">
+                      <a:avLst/>
+                    </a:prstGeom>
+                  </pic:spPr>
+                </pic:pic>
+              </a:graphicData>
+            </a:graphic>
+          </wp:inline>
+        </w:drawing>
+      </w:r>
+    </w:p>
+    <w:p/>
+    <w:p>
+      <w:pPr>
+        <w:pStyle w:val="Heading2"/>
+      </w:pPr>
+      <w:r>
+        <w:lastRenderedPageBreak/>
+        <w:t>Bài 4: Tạo Dockerfile chạy một trang web tĩnh bằng Nginx</w:t>
+      </w:r>
+    </w:p>
+    <w:p>
+      <w:r>
+        <w:drawing>
+          <wp:inline distT="0" distB="0" distL="0" distR="0" wp14:anchorId="64C925BE" wp14:editId="474100B8">
+            <wp:extent cx="5943600" cy="4163060"/>
+            <wp:effectExtent l="0" t="0" r="0" b="8890"/>
+            <wp:docPr id="532643119" name="Picture 1"/>
+            <wp:cNvGraphicFramePr>
+              <a:graphicFrameLocks xmlns:a="http://schemas.openxmlformats.org/drawingml/2006/main" noChangeAspect="1"/>
+            </wp:cNvGraphicFramePr>
+            <a:graphic xmlns:a="http://schemas.openxmlformats.org/drawingml/2006/main">
+              <a:graphicData uri="http://schemas.openxmlformats.org/drawingml/2006/picture">
+                <pic:pic xmlns:pic="http://schemas.openxmlformats.org/drawingml/2006/picture">
+                  <pic:nvPicPr>
+                    <pic:cNvPr id="532643119" name=""/>
+                    <pic:cNvPicPr/>
+                  </pic:nvPicPr>
+                  <pic:blipFill>
+                    <a:blip r:embed="rId39"/>
+                    <a:stretch>
+                      <a:fillRect/>
+                    </a:stretch>
+                  </pic:blipFill>
+                  <pic:spPr>
+                    <a:xfrm>
+                      <a:off x="0" y="0"/>
+                      <a:ext cx="5943600" cy="4163060"/>
+                    </a:xfrm>
+                    <a:prstGeom prst="rect">
+                      <a:avLst/>
+                    </a:prstGeom>
+                  </pic:spPr>
+                </pic:pic>
+              </a:graphicData>
+            </a:graphic>
+          </wp:inline>
+        </w:drawing>
+      </w:r>
+    </w:p>
+    <w:p/>
+    <w:p>
+      <w:pPr>
+        <w:pStyle w:val="Heading2"/>
+      </w:pPr>
+      <w:r>
+        <w:t>Bài 5: Tạo Dockerfile cho ứng dụng Go</w:t>
+      </w:r>
+    </w:p>
+    <w:p/>
     <w:sectPr>
       <w:pgSz w:w="12240" w:h="15840"/>
       <w:pgMar w:top="1440" w:right="1440" w:bottom="1440" w:left="1440" w:header="720" w:footer="720" w:gutter="0"/>
@@ -1656,6 +4982,12 @@
   </w:num>
   <w:num w:numId="2" w16cid:durableId="2111392831">
     <w:abstractNumId w:val="0"/>
+  </w:num>
+  <w:num w:numId="3" w16cid:durableId="1746874903">
+    <w:abstractNumId w:val="0"/>
+    <w:lvlOverride w:ilvl="0">
+      <w:startOverride w:val="1"/>
+    </w:lvlOverride>
   </w:num>
 </w:numbering>
 </file>
@@ -2580,6 +5912,67 @@
       <w:spacing w:val="5"/>
     </w:rPr>
   </w:style>
+  <w:style w:type="paragraph" w:styleId="TOCHeading">
+    <w:name w:val="TOC Heading"/>
+    <w:basedOn w:val="Heading1"/>
+    <w:next w:val="Normal"/>
+    <w:uiPriority w:val="39"/>
+    <w:unhideWhenUsed/>
+    <w:qFormat/>
+    <w:rsid w:val="00C75C41"/>
+    <w:pPr>
+      <w:numPr>
+        <w:numId w:val="0"/>
+      </w:numPr>
+      <w:spacing w:before="240" w:after="0" w:line="259" w:lineRule="auto"/>
+      <w:outlineLvl w:val="9"/>
+    </w:pPr>
+    <w:rPr>
+      <w:rFonts w:asciiTheme="majorHAnsi" w:hAnsiTheme="majorHAnsi"/>
+      <w:b w:val="0"/>
+      <w:color w:val="0F4761" w:themeColor="accent1" w:themeShade="BF"/>
+      <w:kern w:val="0"/>
+      <w:sz w:val="32"/>
+      <w:szCs w:val="32"/>
+      <w14:ligatures w14:val="none"/>
+    </w:rPr>
+  </w:style>
+  <w:style w:type="paragraph" w:styleId="TOC1">
+    <w:name w:val="toc 1"/>
+    <w:basedOn w:val="Normal"/>
+    <w:next w:val="Normal"/>
+    <w:autoRedefine/>
+    <w:uiPriority w:val="39"/>
+    <w:unhideWhenUsed/>
+    <w:rsid w:val="00C75C41"/>
+    <w:pPr>
+      <w:spacing w:after="100"/>
+    </w:pPr>
+  </w:style>
+  <w:style w:type="paragraph" w:styleId="TOC2">
+    <w:name w:val="toc 2"/>
+    <w:basedOn w:val="Normal"/>
+    <w:next w:val="Normal"/>
+    <w:autoRedefine/>
+    <w:uiPriority w:val="39"/>
+    <w:unhideWhenUsed/>
+    <w:rsid w:val="00C75C41"/>
+    <w:pPr>
+      <w:spacing w:after="100"/>
+      <w:ind w:left="280"/>
+    </w:pPr>
+  </w:style>
+  <w:style w:type="character" w:styleId="Hyperlink">
+    <w:name w:val="Hyperlink"/>
+    <w:basedOn w:val="DefaultParagraphFont"/>
+    <w:uiPriority w:val="99"/>
+    <w:unhideWhenUsed/>
+    <w:rsid w:val="00C75C41"/>
+    <w:rPr>
+      <w:color w:val="467886" w:themeColor="hyperlink"/>
+      <w:u w:val="single"/>
+    </w:rPr>
+  </w:style>
 </w:styles>
 </file>
 
@@ -2876,4 +6269,16 @@
     </a:ext>
   </a:extLst>
 </a:theme>
+</file>
+
+<file path=customXml/item1.xml><?xml version="1.0" encoding="utf-8"?>
+<b:Sources xmlns:b="http://schemas.openxmlformats.org/officeDocument/2006/bibliography" xmlns="http://schemas.openxmlformats.org/officeDocument/2006/bibliography" SelectedStyle="\APASixthEditionOfficeOnline.xsl" StyleName="APA" Version="6"/>
+</file>
+
+<file path=customXml/itemProps1.xml><?xml version="1.0" encoding="utf-8"?>
+<ds:datastoreItem xmlns:ds="http://schemas.openxmlformats.org/officeDocument/2006/customXml" ds:itemID="{613AECBF-5505-438E-8F2A-4521B3A3D7AD}">
+  <ds:schemaRefs>
+    <ds:schemaRef ds:uri="http://schemas.openxmlformats.org/officeDocument/2006/bibliography"/>
+  </ds:schemaRefs>
+</ds:datastoreItem>
 </file>
</xml_diff>